<commit_message>
Se agregan objetivos a la solicitud
</commit_message>
<xml_diff>
--- a/SolicitudTitulacionTesis.docx
+++ b/SolicitudTitulacionTesis.docx
@@ -336,8 +336,6 @@
     </w:p>
     <w:p>
       <w:pPr>
-        <w:pStyle w:val="Prrafodelista"/>
-        <w:ind w:left="360"/>
         <w:jc w:val="both"/>
         <w:rPr>
           <w:rFonts w:ascii="Arial" w:hAnsi="Arial" w:cs="Arial"/>
@@ -351,7 +349,33 @@
           <w:sz w:val="24"/>
           <w:szCs w:val="24"/>
         </w:rPr>
-        <w:t xml:space="preserve">El objetivo de esta tesis es diseñar y programar una aplicación interactiva con mecánicas de juego enfocadas en el entrenamiento motor de movimientos de pronación, supinación, flexión y extensión de la muñeca, extensión y flexión de la mano, así como ejercicios del brazo sobre 3 planos, para los cuales se hará uso del dispositivo </w:t>
+        <w:t>El objetivo de esta tesis es diseñar y programar una aplicación interactiva</w:t>
+      </w:r>
+      <w:r>
+        <w:rPr>
+          <w:rFonts w:ascii="Arial" w:hAnsi="Arial" w:cs="Arial"/>
+          <w:sz w:val="24"/>
+          <w:szCs w:val="24"/>
+        </w:rPr>
+        <w:t xml:space="preserve"> constituida por 4 </w:t>
+      </w:r>
+      <w:proofErr w:type="spellStart"/>
+      <w:r>
+        <w:rPr>
+          <w:rFonts w:ascii="Arial" w:hAnsi="Arial" w:cs="Arial"/>
+          <w:sz w:val="24"/>
+          <w:szCs w:val="24"/>
+        </w:rPr>
+        <w:t>minijuegos</w:t>
+      </w:r>
+      <w:proofErr w:type="spellEnd"/>
+      <w:r>
+        <w:rPr>
+          <w:rFonts w:ascii="Arial" w:hAnsi="Arial" w:cs="Arial"/>
+          <w:sz w:val="24"/>
+          <w:szCs w:val="24"/>
+        </w:rPr>
+        <w:t xml:space="preserve"> con mecánicas de juego enfocadas en el entrenamiento motor de movimientos de pronación, supinación, flexión y extensión de la muñeca, extensión y flexión de la mano, así como ejercicios del brazo sobre 3 planos, para los cuales se hará uso del dispositivo </w:t>
       </w:r>
       <w:r>
         <w:rPr>
@@ -464,6 +488,249 @@
     </w:p>
     <w:p>
       <w:pPr>
+        <w:jc w:val="both"/>
+        <w:rPr>
+          <w:rFonts w:ascii="Arial" w:hAnsi="Arial" w:cs="Arial"/>
+          <w:sz w:val="24"/>
+          <w:szCs w:val="24"/>
+        </w:rPr>
+      </w:pPr>
+      <w:r>
+        <w:rPr>
+          <w:rFonts w:ascii="Arial" w:hAnsi="Arial" w:cs="Arial"/>
+          <w:sz w:val="24"/>
+          <w:szCs w:val="24"/>
+        </w:rPr>
+        <w:t>Se propone el desarrollo de una aplicación interactiva, enfocada específicamente en la rehabilitación distal del miembro superior. La mecánica del juego establece una relación directa entre el movimiento físico del usuario y un entorno virtual, en el cual el participante controla en 4 diferentes escenarios</w:t>
+      </w:r>
+      <w:r>
+        <w:rPr>
+          <w:rFonts w:ascii="Arial" w:hAnsi="Arial" w:cs="Arial"/>
+          <w:sz w:val="24"/>
+          <w:szCs w:val="24"/>
+        </w:rPr>
+        <w:t>,</w:t>
+      </w:r>
+      <w:r>
+        <w:rPr>
+          <w:rFonts w:ascii="Arial" w:hAnsi="Arial" w:cs="Arial"/>
+          <w:sz w:val="24"/>
+          <w:szCs w:val="24"/>
+        </w:rPr>
+        <w:t xml:space="preserve"> los movimientos de manos virtuales para trabajar la </w:t>
+      </w:r>
+      <w:r>
+        <w:rPr>
+          <w:rFonts w:ascii="Arial" w:hAnsi="Arial" w:cs="Arial"/>
+          <w:sz w:val="24"/>
+          <w:szCs w:val="24"/>
+        </w:rPr>
+        <w:t>pronación, supinación, flexión y extensión de la muñeca, extensión y flexión de la mano, así como ejercicios del brazo sobre 3 planos</w:t>
+      </w:r>
+      <w:r>
+        <w:rPr>
+          <w:rFonts w:ascii="Arial" w:hAnsi="Arial" w:cs="Arial"/>
+          <w:sz w:val="24"/>
+          <w:szCs w:val="24"/>
+        </w:rPr>
+        <w:t xml:space="preserve">. A diferencia de sistemas convencionales, la interacción con la </w:t>
+      </w:r>
+      <w:r>
+        <w:rPr>
+          <w:rFonts w:ascii="Arial" w:hAnsi="Arial" w:cs="Arial"/>
+          <w:i/>
+          <w:sz w:val="24"/>
+          <w:szCs w:val="24"/>
+        </w:rPr>
+        <w:t>UI</w:t>
+      </w:r>
+      <w:r>
+        <w:rPr>
+          <w:rFonts w:ascii="Arial" w:hAnsi="Arial" w:cs="Arial"/>
+          <w:sz w:val="24"/>
+          <w:szCs w:val="24"/>
+        </w:rPr>
+        <w:t xml:space="preserve"> se realiza sin el uso de los controles incluidos en el </w:t>
+      </w:r>
+      <w:r>
+        <w:rPr>
+          <w:rFonts w:ascii="Arial" w:hAnsi="Arial" w:cs="Arial"/>
+          <w:i/>
+          <w:sz w:val="24"/>
+          <w:szCs w:val="24"/>
+        </w:rPr>
+        <w:t xml:space="preserve">Meta </w:t>
+      </w:r>
+      <w:proofErr w:type="spellStart"/>
+      <w:r>
+        <w:rPr>
+          <w:rFonts w:ascii="Arial" w:hAnsi="Arial" w:cs="Arial"/>
+          <w:i/>
+          <w:sz w:val="24"/>
+          <w:szCs w:val="24"/>
+        </w:rPr>
+        <w:t>Quest</w:t>
+      </w:r>
+      <w:proofErr w:type="spellEnd"/>
+      <w:r>
+        <w:rPr>
+          <w:rFonts w:ascii="Arial" w:hAnsi="Arial" w:cs="Arial"/>
+          <w:i/>
+          <w:sz w:val="24"/>
+          <w:szCs w:val="24"/>
+        </w:rPr>
+        <w:t xml:space="preserve"> 3S</w:t>
+      </w:r>
+      <w:r>
+        <w:rPr>
+          <w:rFonts w:ascii="Arial" w:hAnsi="Arial" w:cs="Arial"/>
+          <w:sz w:val="24"/>
+          <w:szCs w:val="24"/>
+        </w:rPr>
+        <w:t>, sino</w:t>
+      </w:r>
+      <w:r>
+        <w:rPr>
+          <w:rFonts w:ascii="Arial" w:hAnsi="Arial" w:cs="Arial"/>
+          <w:sz w:val="24"/>
+          <w:szCs w:val="24"/>
+        </w:rPr>
+        <w:t>,</w:t>
+      </w:r>
+      <w:r>
+        <w:rPr>
+          <w:rFonts w:ascii="Arial" w:hAnsi="Arial" w:cs="Arial"/>
+          <w:sz w:val="24"/>
+          <w:szCs w:val="24"/>
+        </w:rPr>
+        <w:t xml:space="preserve"> a través del </w:t>
+      </w:r>
+      <w:proofErr w:type="spellStart"/>
+      <w:r>
+        <w:rPr>
+          <w:rFonts w:ascii="Arial" w:hAnsi="Arial" w:cs="Arial"/>
+          <w:i/>
+          <w:sz w:val="24"/>
+          <w:szCs w:val="24"/>
+        </w:rPr>
+        <w:t>poking</w:t>
+      </w:r>
+      <w:proofErr w:type="spellEnd"/>
+      <w:r>
+        <w:rPr>
+          <w:rFonts w:ascii="Arial" w:hAnsi="Arial" w:cs="Arial"/>
+          <w:sz w:val="24"/>
+          <w:szCs w:val="24"/>
+        </w:rPr>
+        <w:t xml:space="preserve"> </w:t>
+      </w:r>
+      <w:r>
+        <w:rPr>
+          <w:rFonts w:ascii="Arial" w:hAnsi="Arial" w:cs="Arial"/>
+          <w:sz w:val="24"/>
+          <w:szCs w:val="24"/>
+        </w:rPr>
+        <w:t>implementad en el</w:t>
+      </w:r>
+      <w:r>
+        <w:rPr>
+          <w:rFonts w:ascii="Arial" w:hAnsi="Arial" w:cs="Arial"/>
+          <w:sz w:val="24"/>
+          <w:szCs w:val="24"/>
+        </w:rPr>
+        <w:t xml:space="preserve"> </w:t>
+      </w:r>
+      <w:proofErr w:type="spellStart"/>
+      <w:r>
+        <w:rPr>
+          <w:rFonts w:ascii="Arial" w:hAnsi="Arial" w:cs="Arial"/>
+          <w:i/>
+          <w:sz w:val="24"/>
+          <w:szCs w:val="24"/>
+        </w:rPr>
+        <w:t>hand</w:t>
+      </w:r>
+      <w:proofErr w:type="spellEnd"/>
+      <w:r>
+        <w:rPr>
+          <w:rFonts w:ascii="Arial" w:hAnsi="Arial" w:cs="Arial"/>
+          <w:i/>
+          <w:sz w:val="24"/>
+          <w:szCs w:val="24"/>
+        </w:rPr>
+        <w:t xml:space="preserve"> tracking</w:t>
+      </w:r>
+      <w:r>
+        <w:rPr>
+          <w:rFonts w:ascii="Arial" w:hAnsi="Arial" w:cs="Arial"/>
+          <w:sz w:val="24"/>
+          <w:szCs w:val="24"/>
+        </w:rPr>
+        <w:t>; se busca implementar de esta manera para evitar sobre estimular al paciente</w:t>
+      </w:r>
+      <w:r>
+        <w:rPr>
+          <w:rFonts w:ascii="Arial" w:hAnsi="Arial" w:cs="Arial"/>
+          <w:sz w:val="24"/>
+          <w:szCs w:val="24"/>
+        </w:rPr>
+        <w:t>. Por otro lado,</w:t>
+      </w:r>
+      <w:r>
+        <w:rPr>
+          <w:rFonts w:ascii="Arial" w:hAnsi="Arial" w:cs="Arial"/>
+          <w:sz w:val="24"/>
+          <w:szCs w:val="24"/>
+        </w:rPr>
+        <w:t xml:space="preserve"> se puede configurar el tiempo de vida y velocidad de algunos obstáculos dependiendo del caso, si el usuario presenta un buen manejo de las mecánicas del </w:t>
+      </w:r>
+      <w:proofErr w:type="spellStart"/>
+      <w:r>
+        <w:rPr>
+          <w:rFonts w:ascii="Arial" w:hAnsi="Arial" w:cs="Arial"/>
+          <w:sz w:val="24"/>
+          <w:szCs w:val="24"/>
+        </w:rPr>
+        <w:t>minijuego</w:t>
+      </w:r>
+      <w:proofErr w:type="spellEnd"/>
+      <w:r>
+        <w:rPr>
+          <w:rFonts w:ascii="Arial" w:hAnsi="Arial" w:cs="Arial"/>
+          <w:sz w:val="24"/>
+          <w:szCs w:val="24"/>
+        </w:rPr>
+        <w:t xml:space="preserve">, la dificultad de este aumentará considerablemente, caso contrario si presenta dificultades durante el proceso de terapia. Así mismo, </w:t>
+      </w:r>
+      <w:r>
+        <w:rPr>
+          <w:rFonts w:ascii="Arial" w:hAnsi="Arial" w:cs="Arial"/>
+          <w:sz w:val="24"/>
+          <w:szCs w:val="24"/>
+        </w:rPr>
+        <w:t xml:space="preserve">es posible </w:t>
+      </w:r>
+      <w:r>
+        <w:rPr>
+          <w:rFonts w:ascii="Arial" w:hAnsi="Arial" w:cs="Arial"/>
+          <w:sz w:val="24"/>
+          <w:szCs w:val="24"/>
+        </w:rPr>
+        <w:t>calibrar algunas interacciones del usuario en base al rango de estiramiento de su brazo sano.</w:t>
+      </w:r>
+    </w:p>
+    <w:p>
+      <w:pPr>
+        <w:jc w:val="both"/>
+        <w:rPr>
+          <w:rFonts w:ascii="Arial" w:hAnsi="Arial" w:cs="Arial"/>
+          <w:sz w:val="24"/>
+          <w:szCs w:val="24"/>
+        </w:rPr>
+      </w:pPr>
+    </w:p>
+    <w:p>
+      <w:pPr>
         <w:pStyle w:val="Prrafodelista"/>
         <w:numPr>
           <w:ilvl w:val="0"/>
@@ -484,6 +751,7 @@
           <w:sz w:val="24"/>
           <w:szCs w:val="24"/>
         </w:rPr>
+        <w:lastRenderedPageBreak/>
         <w:t>Justificación</w:t>
       </w:r>
     </w:p>
@@ -657,7 +925,23 @@
           <w:sz w:val="24"/>
           <w:szCs w:val="24"/>
         </w:rPr>
-        <w:t xml:space="preserve">El dispositivo también funciona como herramienta de desarrollo ya que, mediante una conexión </w:t>
+        <w:t>El dispositivo también funciona como herramienta de desarrollo</w:t>
+      </w:r>
+      <w:r>
+        <w:rPr>
+          <w:rFonts w:ascii="Arial" w:hAnsi="Arial" w:cs="Arial"/>
+          <w:sz w:val="24"/>
+          <w:szCs w:val="24"/>
+        </w:rPr>
+        <w:t>,</w:t>
+      </w:r>
+      <w:r>
+        <w:rPr>
+          <w:rFonts w:ascii="Arial" w:hAnsi="Arial" w:cs="Arial"/>
+          <w:sz w:val="24"/>
+          <w:szCs w:val="24"/>
+        </w:rPr>
+        <w:t xml:space="preserve"> ya que, mediante una conexión </w:t>
       </w:r>
       <w:r>
         <w:rPr>
@@ -691,7 +975,17 @@
           <w:sz w:val="24"/>
           <w:szCs w:val="24"/>
         </w:rPr>
-        <w:t xml:space="preserve">permite probar lo que se va implementando en la aplicación, así como el funcionamiento correcto del </w:t>
+        <w:t>permite probar lo que se v</w:t>
+      </w:r>
+      <w:bookmarkStart w:id="0" w:name="_GoBack"/>
+      <w:bookmarkEnd w:id="0"/>
+      <w:r>
+        <w:rPr>
+          <w:rFonts w:ascii="Arial" w:hAnsi="Arial" w:cs="Arial"/>
+          <w:sz w:val="24"/>
+          <w:szCs w:val="24"/>
+        </w:rPr>
+        <w:t xml:space="preserve">a implementando en la aplicación, así como el funcionamiento correcto del </w:t>
       </w:r>
       <w:proofErr w:type="spellStart"/>
       <w:r>
@@ -721,6 +1015,18 @@
         </w:rPr>
         <w:t>.</w:t>
       </w:r>
+    </w:p>
+    <w:p>
+      <w:pPr>
+        <w:pStyle w:val="Prrafodelista"/>
+        <w:ind w:left="792"/>
+        <w:jc w:val="both"/>
+        <w:rPr>
+          <w:rFonts w:ascii="Arial" w:hAnsi="Arial" w:cs="Arial"/>
+          <w:sz w:val="24"/>
+          <w:szCs w:val="24"/>
+        </w:rPr>
+      </w:pPr>
     </w:p>
     <w:p>
       <w:pPr>
@@ -864,16 +1170,7 @@
           <w:sz w:val="24"/>
           <w:szCs w:val="24"/>
         </w:rPr>
-        <w:t xml:space="preserve">necesarios para la creación de </w:t>
-      </w:r>
-      <w:r>
-        <w:rPr>
-          <w:rFonts w:ascii="Arial" w:hAnsi="Arial" w:cs="Arial"/>
-          <w:sz w:val="24"/>
-          <w:szCs w:val="24"/>
-        </w:rPr>
-        <w:lastRenderedPageBreak/>
-        <w:t xml:space="preserve">aplicaciones en </w:t>
+        <w:t xml:space="preserve">necesarios para la creación de aplicaciones en </w:t>
       </w:r>
       <w:r>
         <w:rPr>
@@ -896,6 +1193,7 @@
       <w:r>
         <w:rPr>
           <w:rFonts w:ascii="Arial" w:hAnsi="Arial" w:cs="Arial"/>
+          <w:i/>
           <w:sz w:val="24"/>
           <w:szCs w:val="24"/>
         </w:rPr>
@@ -946,6 +1244,18 @@
         </w:rPr>
         <w:t>, Linux, etc.).</w:t>
       </w:r>
+    </w:p>
+    <w:p>
+      <w:pPr>
+        <w:pStyle w:val="Prrafodelista"/>
+        <w:ind w:left="792"/>
+        <w:jc w:val="both"/>
+        <w:rPr>
+          <w:rFonts w:ascii="Arial" w:hAnsi="Arial" w:cs="Arial"/>
+          <w:sz w:val="24"/>
+          <w:szCs w:val="24"/>
+        </w:rPr>
+      </w:pPr>
     </w:p>
     <w:p>
       <w:pPr>
@@ -1095,6 +1405,18 @@
     <w:p>
       <w:pPr>
         <w:pStyle w:val="Prrafodelista"/>
+        <w:ind w:left="792"/>
+        <w:jc w:val="both"/>
+        <w:rPr>
+          <w:rFonts w:ascii="Arial" w:hAnsi="Arial" w:cs="Arial"/>
+          <w:sz w:val="24"/>
+          <w:szCs w:val="24"/>
+        </w:rPr>
+      </w:pPr>
+    </w:p>
+    <w:p>
+      <w:pPr>
+        <w:pStyle w:val="Prrafodelista"/>
         <w:numPr>
           <w:ilvl w:val="0"/>
           <w:numId w:val="7"/>
@@ -1119,8 +1441,6 @@
     </w:p>
     <w:p>
       <w:pPr>
-        <w:pStyle w:val="Prrafodelista"/>
-        <w:ind w:left="360"/>
         <w:jc w:val="both"/>
         <w:rPr>
           <w:rFonts w:ascii="Arial" w:hAnsi="Arial" w:cs="Arial"/>
@@ -1344,8 +1664,6 @@
         </w:rPr>
         <w:t>Propuesta de bibliografía</w:t>
       </w:r>
-      <w:bookmarkStart w:id="0" w:name="_GoBack"/>
-      <w:bookmarkEnd w:id="0"/>
     </w:p>
     <w:p>
       <w:pPr>
@@ -1458,6 +1776,7 @@
           <w:noProof/>
           <w:sz w:val="24"/>
           <w:szCs w:val="24"/>
+          <w:lang w:eastAsia="es-ES"/>
         </w:rPr>
         <mc:AlternateContent>
           <mc:Choice Requires="wps">
@@ -1465,10 +1784,10 @@
               <wp:anchor distT="45720" distB="45720" distL="114300" distR="114300" simplePos="0" relativeHeight="251663360" behindDoc="0" locked="0" layoutInCell="1" allowOverlap="1" wp14:anchorId="00378808" wp14:editId="6D6A4982">
                 <wp:simplePos x="0" y="0"/>
                 <wp:positionH relativeFrom="margin">
-                  <wp:posOffset>2400300</wp:posOffset>
+                  <wp:posOffset>2647950</wp:posOffset>
                 </wp:positionH>
                 <wp:positionV relativeFrom="paragraph">
-                  <wp:posOffset>328930</wp:posOffset>
+                  <wp:posOffset>338455</wp:posOffset>
                 </wp:positionV>
                 <wp:extent cx="2985135" cy="1404620"/>
                 <wp:effectExtent l="0" t="0" r="5715" b="8255"/>
@@ -1600,7 +1919,7 @@
                 <v:stroke joinstyle="miter"/>
                 <v:path gradientshapeok="t" o:connecttype="rect"/>
               </v:shapetype>
-              <v:shape id="Cuadro de texto 2" o:spid="_x0000_s1026" type="#_x0000_t202" style="position:absolute;left:0;text-align:left;margin-left:189pt;margin-top:25.9pt;width:235.05pt;height:110.6pt;z-index:251663360;visibility:visible;mso-wrap-style:square;mso-width-percent:0;mso-height-percent:200;mso-wrap-distance-left:9pt;mso-wrap-distance-top:3.6pt;mso-wrap-distance-right:9pt;mso-wrap-distance-bottom:3.6pt;mso-position-horizontal:absolute;mso-position-horizontal-relative:margin;mso-position-vertical:absolute;mso-position-vertical-relative:text;mso-width-percent:0;mso-height-percent:200;mso-width-relative:margin;mso-height-relative:margin;v-text-anchor:top" o:gfxdata="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" stroked="f">
+              <v:shape id="Cuadro de texto 2" o:spid="_x0000_s1026" type="#_x0000_t202" style="position:absolute;left:0;text-align:left;margin-left:208.5pt;margin-top:26.65pt;width:235.05pt;height:110.6pt;z-index:251663360;visibility:visible;mso-wrap-style:square;mso-width-percent:0;mso-height-percent:200;mso-wrap-distance-left:9pt;mso-wrap-distance-top:3.6pt;mso-wrap-distance-right:9pt;mso-wrap-distance-bottom:3.6pt;mso-position-horizontal:absolute;mso-position-horizontal-relative:margin;mso-position-vertical:absolute;mso-position-vertical-relative:text;mso-width-percent:0;mso-height-percent:200;mso-width-relative:margin;mso-height-relative:margin;v-text-anchor:top" o:gfxdata="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" stroked="f">
                 <v:textbox style="mso-fit-shape-to-text:t">
                   <w:txbxContent>
                     <w:p>
@@ -1692,6 +2011,7 @@
           <w:noProof/>
           <w:sz w:val="24"/>
           <w:szCs w:val="24"/>
+          <w:lang w:eastAsia="es-ES"/>
         </w:rPr>
         <mc:AlternateContent>
           <mc:Choice Requires="wps">
@@ -1856,7 +2176,7 @@
     </w:p>
     <w:sectPr>
       <w:pgSz w:w="11906" w:h="16838"/>
-      <w:pgMar w:top="1417" w:right="1701" w:bottom="1417" w:left="1701" w:header="708" w:footer="708" w:gutter="0"/>
+      <w:pgMar w:top="1440" w:right="1080" w:bottom="1440" w:left="1080" w:header="708" w:footer="708" w:gutter="0"/>
       <w:cols w:space="708"/>
       <w:docGrid w:linePitch="360"/>
     </w:sectPr>

</xml_diff>

<commit_message>
Ajustes preeliminares a la solicitud y plan de trabajo
</commit_message>
<xml_diff>
--- a/SolicitudTitulacionTesis.docx
+++ b/SolicitudTitulacionTesis.docx
@@ -62,6 +62,7 @@
     </w:p>
     <w:p>
       <w:pPr>
+        <w:spacing w:after="0"/>
         <w:rPr>
           <w:rFonts w:ascii="Arial" w:hAnsi="Arial" w:cs="Arial"/>
           <w:b/>
@@ -81,6 +82,7 @@
     </w:p>
     <w:p>
       <w:pPr>
+        <w:spacing w:after="0"/>
         <w:jc w:val="both"/>
         <w:rPr>
           <w:rFonts w:ascii="Arial" w:hAnsi="Arial" w:cs="Arial"/>
@@ -101,6 +103,7 @@
     </w:p>
     <w:p>
       <w:pPr>
+        <w:spacing w:after="0"/>
         <w:jc w:val="both"/>
         <w:rPr>
           <w:rFonts w:ascii="Arial" w:hAnsi="Arial" w:cs="Arial"/>
@@ -118,6 +121,18 @@
         </w:rPr>
         <w:t>Universidad Nacional Autónoma de México</w:t>
       </w:r>
+    </w:p>
+    <w:p>
+      <w:pPr>
+        <w:spacing w:after="0"/>
+        <w:jc w:val="both"/>
+        <w:rPr>
+          <w:rFonts w:ascii="Arial" w:hAnsi="Arial" w:cs="Arial"/>
+          <w:b/>
+          <w:sz w:val="24"/>
+          <w:szCs w:val="24"/>
+        </w:rPr>
+      </w:pPr>
     </w:p>
     <w:p>
       <w:pPr>
@@ -451,8 +466,6 @@
     </w:p>
     <w:p>
       <w:pPr>
-        <w:pStyle w:val="Prrafodelista"/>
-        <w:ind w:left="360"/>
         <w:jc w:val="both"/>
         <w:rPr>
           <w:rFonts w:ascii="Arial" w:hAnsi="Arial" w:cs="Arial"/>
@@ -501,7 +514,33 @@
           <w:sz w:val="24"/>
           <w:szCs w:val="24"/>
         </w:rPr>
-        <w:t>Se propone el desarrollo de una aplicación interactiva, enfocada específicamente en la rehabilitación distal del miembro superior. La mecánica del juego establece una relación directa entre el movimiento físico del usuario y un entorno virtual, en el cual el participante controla en 4 diferentes escenarios</w:t>
+        <w:t>A nivel mundial, el Evento Vascular Cerebral (EVC) se posiciona como una de las principales causas de discapacidad adquirida en la población adulta. Para recibir rehabilitación oportuna dentro de la ventana de tiempo en la cual aún podrían recuperar parte de su movilidad, los pacientes que sobreviven a padecimientos como la hemiparesia, suelen encontrar obstáculos considerables tales como la dificultad de traslado, la saturación de los servicios de salud y tiempos de espera prolongados. Sumado a esto, las rutinas clínicas tradicionales suelen ser percibidas como monótonas, lo que impacta negativamente en el ánimo y la constancia del usuario.</w:t>
+      </w:r>
+    </w:p>
+    <w:p>
+      <w:pPr>
+        <w:jc w:val="both"/>
+        <w:rPr>
+          <w:rFonts w:ascii="Arial" w:hAnsi="Arial" w:cs="Arial"/>
+          <w:sz w:val="24"/>
+          <w:szCs w:val="24"/>
+        </w:rPr>
+      </w:pPr>
+      <w:r>
+        <w:rPr>
+          <w:rFonts w:ascii="Arial" w:hAnsi="Arial" w:cs="Arial"/>
+          <w:sz w:val="24"/>
+          <w:szCs w:val="24"/>
+        </w:rPr>
+        <w:t>Para hacer frente a estos obstáculos, s</w:t>
+      </w:r>
+      <w:r>
+        <w:rPr>
+          <w:rFonts w:ascii="Arial" w:hAnsi="Arial" w:cs="Arial"/>
+          <w:sz w:val="24"/>
+          <w:szCs w:val="24"/>
+        </w:rPr>
+        <w:t>e propone el desarrollo de una aplicación interactiva, enfocada específicamente en la rehabilitación distal del miembro superior. La mecánica del juego establece una relación directa entre el movimiento físico del usuario y un entorno virtual, en el cual el participante controla en 4 diferentes escenarios</w:t>
       </w:r>
       <w:r>
         <w:rPr>
@@ -517,23 +556,7 @@
           <w:sz w:val="24"/>
           <w:szCs w:val="24"/>
         </w:rPr>
-        <w:t xml:space="preserve"> los movimientos de manos virtuales para trabajar la </w:t>
-      </w:r>
-      <w:r>
-        <w:rPr>
-          <w:rFonts w:ascii="Arial" w:hAnsi="Arial" w:cs="Arial"/>
-          <w:sz w:val="24"/>
-          <w:szCs w:val="24"/>
-        </w:rPr>
-        <w:t>pronación, supinación, flexión y extensión de la muñeca, extensión y flexión de la mano, así como ejercicios del brazo sobre 3 planos</w:t>
-      </w:r>
-      <w:r>
-        <w:rPr>
-          <w:rFonts w:ascii="Arial" w:hAnsi="Arial" w:cs="Arial"/>
-          <w:sz w:val="24"/>
-          <w:szCs w:val="24"/>
-        </w:rPr>
-        <w:t xml:space="preserve">. A diferencia de sistemas convencionales, la interacción con la </w:t>
+        <w:t xml:space="preserve"> los movimientos de manos virtuales para trabajar la pronación, supinación, flexión y extensión de la muñeca, extensión y flexión de la mano, así como ejercicios del brazo sobre 3 planos. A diferencia de sistemas convencionales, la interacción con la </w:t>
       </w:r>
       <w:r>
         <w:rPr>
@@ -550,7 +573,16 @@
           <w:sz w:val="24"/>
           <w:szCs w:val="24"/>
         </w:rPr>
-        <w:t xml:space="preserve"> se realiza sin el uso de los controles incluidos en el </w:t>
+        <w:t xml:space="preserve"> se realiza sin el uso de los controles </w:t>
+      </w:r>
+      <w:r>
+        <w:rPr>
+          <w:rFonts w:ascii="Arial" w:hAnsi="Arial" w:cs="Arial"/>
+          <w:sz w:val="24"/>
+          <w:szCs w:val="24"/>
+        </w:rPr>
+        <w:lastRenderedPageBreak/>
+        <w:t xml:space="preserve">incluidos en el </w:t>
       </w:r>
       <w:r>
         <w:rPr>
@@ -751,9 +783,270 @@
           <w:sz w:val="24"/>
           <w:szCs w:val="24"/>
         </w:rPr>
-        <w:lastRenderedPageBreak/>
         <w:t>Justificación</w:t>
       </w:r>
+    </w:p>
+    <w:p>
+      <w:pPr>
+        <w:jc w:val="both"/>
+        <w:rPr>
+          <w:rFonts w:ascii="Arial" w:hAnsi="Arial" w:cs="Arial"/>
+          <w:sz w:val="24"/>
+          <w:szCs w:val="24"/>
+        </w:rPr>
+      </w:pPr>
+      <w:r>
+        <w:rPr>
+          <w:rFonts w:ascii="Arial" w:hAnsi="Arial" w:cs="Arial"/>
+          <w:sz w:val="24"/>
+          <w:szCs w:val="24"/>
+        </w:rPr>
+        <w:t xml:space="preserve">La </w:t>
+      </w:r>
+      <w:r>
+        <w:rPr>
+          <w:rFonts w:ascii="Arial" w:hAnsi="Arial" w:cs="Arial"/>
+          <w:sz w:val="24"/>
+          <w:szCs w:val="24"/>
+        </w:rPr>
+        <w:t>integración de videojuegos serios</w:t>
+      </w:r>
+      <w:r>
+        <w:rPr>
+          <w:rFonts w:ascii="Arial" w:hAnsi="Arial" w:cs="Arial"/>
+          <w:sz w:val="24"/>
+          <w:szCs w:val="24"/>
+        </w:rPr>
+        <w:t xml:space="preserve"> y la </w:t>
+      </w:r>
+      <w:r>
+        <w:rPr>
+          <w:rFonts w:ascii="Arial" w:hAnsi="Arial" w:cs="Arial"/>
+          <w:i/>
+          <w:sz w:val="24"/>
+          <w:szCs w:val="24"/>
+        </w:rPr>
+        <w:t>Realidad Virtual (VR)</w:t>
+      </w:r>
+      <w:r>
+        <w:rPr>
+          <w:rFonts w:ascii="Arial" w:hAnsi="Arial" w:cs="Arial"/>
+          <w:sz w:val="24"/>
+          <w:szCs w:val="24"/>
+        </w:rPr>
+        <w:t xml:space="preserve"> en el ámbito de la </w:t>
+      </w:r>
+      <w:proofErr w:type="spellStart"/>
+      <w:r>
+        <w:rPr>
+          <w:rFonts w:ascii="Arial" w:hAnsi="Arial" w:cs="Arial"/>
+          <w:sz w:val="24"/>
+          <w:szCs w:val="24"/>
+        </w:rPr>
+        <w:t>neuro</w:t>
+      </w:r>
+      <w:proofErr w:type="spellEnd"/>
+      <w:r>
+        <w:rPr>
+          <w:rFonts w:ascii="Arial" w:hAnsi="Arial" w:cs="Arial"/>
+          <w:sz w:val="24"/>
+          <w:szCs w:val="24"/>
+        </w:rPr>
+        <w:t>-rehabilitación ha demostrado ser una herramienta invaluable para fomentar la adherencia</w:t>
+      </w:r>
+      <w:r>
+        <w:rPr>
+          <w:rFonts w:ascii="Arial" w:hAnsi="Arial" w:cs="Arial"/>
+          <w:sz w:val="24"/>
+          <w:szCs w:val="24"/>
+        </w:rPr>
+        <w:t xml:space="preserve"> al tratamiento. Diversos estudios señalan que el uso de aplicaciones de </w:t>
+      </w:r>
+      <w:r>
+        <w:rPr>
+          <w:rFonts w:ascii="Arial" w:hAnsi="Arial" w:cs="Arial"/>
+          <w:i/>
+          <w:sz w:val="24"/>
+          <w:szCs w:val="24"/>
+        </w:rPr>
+        <w:t xml:space="preserve">VR </w:t>
+      </w:r>
+      <w:r>
+        <w:rPr>
+          <w:rFonts w:ascii="Arial" w:hAnsi="Arial" w:cs="Arial"/>
+          <w:sz w:val="24"/>
+          <w:szCs w:val="24"/>
+        </w:rPr>
+        <w:t>no solo es factible y tolerable</w:t>
+      </w:r>
+      <w:r>
+        <w:rPr>
+          <w:rFonts w:ascii="Arial" w:hAnsi="Arial" w:cs="Arial"/>
+          <w:sz w:val="24"/>
+          <w:szCs w:val="24"/>
+        </w:rPr>
+        <w:t>, sino que resulta disfrutable y motivador para los pacientes, Este factor es de vital importancia en los procesos de recuperación a largo plazo, donde mantener el interés y apego al tratamiento suele ser un desafío</w:t>
+      </w:r>
+      <w:r>
+        <w:rPr>
+          <w:rFonts w:ascii="Arial" w:hAnsi="Arial" w:cs="Arial"/>
+          <w:sz w:val="24"/>
+          <w:szCs w:val="24"/>
+        </w:rPr>
+        <w:t xml:space="preserve"> </w:t>
+      </w:r>
+      <w:r>
+        <w:rPr>
+          <w:rFonts w:ascii="Arial" w:hAnsi="Arial" w:cs="Arial"/>
+          <w:sz w:val="24"/>
+          <w:szCs w:val="24"/>
+        </w:rPr>
+        <w:t>considerable</w:t>
+      </w:r>
+      <w:r>
+        <w:rPr>
+          <w:rFonts w:ascii="Arial" w:hAnsi="Arial" w:cs="Arial"/>
+          <w:sz w:val="24"/>
+          <w:szCs w:val="24"/>
+        </w:rPr>
+        <w:t>.</w:t>
+      </w:r>
+    </w:p>
+    <w:p>
+      <w:pPr>
+        <w:jc w:val="both"/>
+        <w:rPr>
+          <w:rFonts w:ascii="Arial" w:hAnsi="Arial" w:cs="Arial"/>
+          <w:sz w:val="24"/>
+          <w:szCs w:val="24"/>
+        </w:rPr>
+      </w:pPr>
+      <w:r>
+        <w:rPr>
+          <w:rFonts w:ascii="Arial" w:hAnsi="Arial" w:cs="Arial"/>
+          <w:sz w:val="24"/>
+          <w:szCs w:val="24"/>
+        </w:rPr>
+        <w:t xml:space="preserve">Además, el uso de </w:t>
+      </w:r>
+      <w:r>
+        <w:rPr>
+          <w:rFonts w:ascii="Arial" w:hAnsi="Arial" w:cs="Arial"/>
+          <w:i/>
+          <w:sz w:val="24"/>
+          <w:szCs w:val="24"/>
+        </w:rPr>
+        <w:t xml:space="preserve">VR </w:t>
+      </w:r>
+      <w:r>
+        <w:rPr>
+          <w:rFonts w:ascii="Arial" w:hAnsi="Arial" w:cs="Arial"/>
+          <w:sz w:val="24"/>
+          <w:szCs w:val="24"/>
+        </w:rPr>
+        <w:t xml:space="preserve">en pacientes con EVC ha demostrado generar beneficios tangibles. Se ha observado que el entrenamiento mediante ejercicios diarios en entornos virtuales produce mejoras significativas en la atención espacial y la conciencia espacial del usuario en comparación con tareas cognitivas estándar. Al prescindir de mando físicos y aprovechar el </w:t>
+      </w:r>
+      <w:proofErr w:type="spellStart"/>
+      <w:r>
+        <w:rPr>
+          <w:rFonts w:ascii="Arial" w:hAnsi="Arial" w:cs="Arial"/>
+          <w:i/>
+          <w:sz w:val="24"/>
+          <w:szCs w:val="24"/>
+        </w:rPr>
+        <w:t>hand</w:t>
+      </w:r>
+      <w:proofErr w:type="spellEnd"/>
+      <w:r>
+        <w:rPr>
+          <w:rFonts w:ascii="Arial" w:hAnsi="Arial" w:cs="Arial"/>
+          <w:i/>
+          <w:sz w:val="24"/>
+          <w:szCs w:val="24"/>
+        </w:rPr>
+        <w:t xml:space="preserve"> tracking </w:t>
+      </w:r>
+      <w:r>
+        <w:rPr>
+          <w:rFonts w:ascii="Arial" w:hAnsi="Arial" w:cs="Arial"/>
+          <w:sz w:val="24"/>
+          <w:szCs w:val="24"/>
+        </w:rPr>
+        <w:t xml:space="preserve">del </w:t>
+      </w:r>
+      <w:r>
+        <w:rPr>
+          <w:rFonts w:ascii="Arial" w:hAnsi="Arial" w:cs="Arial"/>
+          <w:i/>
+          <w:sz w:val="24"/>
+          <w:szCs w:val="24"/>
+        </w:rPr>
+        <w:t xml:space="preserve">Meta </w:t>
+      </w:r>
+      <w:proofErr w:type="spellStart"/>
+      <w:r>
+        <w:rPr>
+          <w:rFonts w:ascii="Arial" w:hAnsi="Arial" w:cs="Arial"/>
+          <w:i/>
+          <w:sz w:val="24"/>
+          <w:szCs w:val="24"/>
+        </w:rPr>
+        <w:t>Quest</w:t>
+      </w:r>
+      <w:proofErr w:type="spellEnd"/>
+      <w:r>
+        <w:rPr>
+          <w:rFonts w:ascii="Arial" w:hAnsi="Arial" w:cs="Arial"/>
+          <w:i/>
+          <w:sz w:val="24"/>
+          <w:szCs w:val="24"/>
+        </w:rPr>
+        <w:t xml:space="preserve"> 3S</w:t>
+      </w:r>
+      <w:r>
+        <w:rPr>
+          <w:rFonts w:ascii="Arial" w:hAnsi="Arial" w:cs="Arial"/>
+          <w:sz w:val="24"/>
+          <w:szCs w:val="24"/>
+        </w:rPr>
+        <w:t xml:space="preserve">, el paciente puede interactuar de forma intuitiva con los 4 </w:t>
+      </w:r>
+      <w:proofErr w:type="spellStart"/>
+      <w:r>
+        <w:rPr>
+          <w:rFonts w:ascii="Arial" w:hAnsi="Arial" w:cs="Arial"/>
+          <w:sz w:val="24"/>
+          <w:szCs w:val="24"/>
+        </w:rPr>
+        <w:t>minijuegos</w:t>
+      </w:r>
+      <w:proofErr w:type="spellEnd"/>
+      <w:r>
+        <w:rPr>
+          <w:rFonts w:ascii="Arial" w:hAnsi="Arial" w:cs="Arial"/>
+          <w:sz w:val="24"/>
+          <w:szCs w:val="24"/>
+        </w:rPr>
+        <w:t>, lo que facilita el entrenamiento</w:t>
+      </w:r>
+      <w:r>
+        <w:rPr>
+          <w:rFonts w:ascii="Arial" w:hAnsi="Arial" w:cs="Arial"/>
+          <w:sz w:val="24"/>
+          <w:szCs w:val="24"/>
+        </w:rPr>
+        <w:t xml:space="preserve"> simultáneo de las funciones motoras de pronación, supinación, flexión y extensión y el enfoque espacial.</w:t>
+      </w:r>
+    </w:p>
+    <w:p>
+      <w:pPr>
+        <w:jc w:val="both"/>
+        <w:rPr>
+          <w:rFonts w:ascii="Arial" w:hAnsi="Arial" w:cs="Arial"/>
+          <w:sz w:val="24"/>
+          <w:szCs w:val="24"/>
+        </w:rPr>
+      </w:pPr>
     </w:p>
     <w:p>
       <w:pPr>
@@ -975,17 +1268,7 @@
           <w:sz w:val="24"/>
           <w:szCs w:val="24"/>
         </w:rPr>
-        <w:t>permite probar lo que se v</w:t>
-      </w:r>
-      <w:bookmarkStart w:id="0" w:name="_GoBack"/>
-      <w:bookmarkEnd w:id="0"/>
-      <w:r>
-        <w:rPr>
-          <w:rFonts w:ascii="Arial" w:hAnsi="Arial" w:cs="Arial"/>
-          <w:sz w:val="24"/>
-          <w:szCs w:val="24"/>
-        </w:rPr>
-        <w:t xml:space="preserve">a implementando en la aplicación, así como el funcionamiento correcto del </w:t>
+        <w:t xml:space="preserve">permite probar lo que se va implementando en la aplicación, así como el funcionamiento correcto del </w:t>
       </w:r>
       <w:proofErr w:type="spellStart"/>
       <w:r>
@@ -1354,7 +1637,16 @@
           <w:sz w:val="24"/>
           <w:szCs w:val="24"/>
         </w:rPr>
-        <w:t xml:space="preserve">. Este al ser Orientado a Objetos, permite que la creación de código sea más organizada, lo cual es de mucha ayuda al estar manejando diferentes mecánicas de juego y sistemas de comunicación con hardware externo. También permite el uso de los </w:t>
+        <w:t xml:space="preserve">. Este al ser Orientado a Objetos, permite que la creación de código sea más organizada, lo cual es de mucha ayuda al estar manejando diferentes mecánicas de juego y sistemas de comunicación con </w:t>
+      </w:r>
+      <w:r>
+        <w:rPr>
+          <w:rFonts w:ascii="Arial" w:hAnsi="Arial" w:cs="Arial"/>
+          <w:sz w:val="24"/>
+          <w:szCs w:val="24"/>
+        </w:rPr>
+        <w:lastRenderedPageBreak/>
+        <w:t xml:space="preserve">hardware externo. También permite el uso de los </w:t>
       </w:r>
       <w:proofErr w:type="spellStart"/>
       <w:r>
@@ -1401,6 +1693,16 @@
         </w:rPr>
         <w:t>, ya que estos se basan en dicho lenguaje.</w:t>
       </w:r>
+    </w:p>
+    <w:p>
+      <w:pPr>
+        <w:jc w:val="both"/>
+        <w:rPr>
+          <w:rFonts w:ascii="Arial" w:hAnsi="Arial" w:cs="Arial"/>
+          <w:sz w:val="24"/>
+          <w:szCs w:val="24"/>
+        </w:rPr>
+      </w:pPr>
     </w:p>
     <w:p>
       <w:pPr>
@@ -1547,48 +1849,14 @@
     <w:p>
       <w:pPr>
         <w:pStyle w:val="Prrafodelista"/>
-        <w:numPr>
-          <w:ilvl w:val="1"/>
-          <w:numId w:val="7"/>
-        </w:numPr>
-        <w:jc w:val="both"/>
-        <w:rPr>
-          <w:rFonts w:ascii="Arial" w:hAnsi="Arial" w:cs="Arial"/>
-          <w:b/>
-          <w:sz w:val="24"/>
-          <w:szCs w:val="24"/>
-        </w:rPr>
-      </w:pPr>
-      <w:r>
-        <w:rPr>
-          <w:rFonts w:ascii="Arial" w:hAnsi="Arial" w:cs="Arial"/>
-          <w:b/>
-          <w:sz w:val="24"/>
-          <w:szCs w:val="24"/>
-        </w:rPr>
-        <w:t>Desarrollo e implementación incremental por etapas</w:t>
-      </w:r>
-    </w:p>
-    <w:p>
-      <w:pPr>
-        <w:pStyle w:val="Prrafodelista"/>
         <w:ind w:left="792"/>
         <w:jc w:val="both"/>
         <w:rPr>
           <w:rFonts w:ascii="Arial" w:hAnsi="Arial" w:cs="Arial"/>
-          <w:b/>
-          <w:sz w:val="24"/>
-          <w:szCs w:val="24"/>
-        </w:rPr>
-      </w:pPr>
-      <w:r>
-        <w:rPr>
-          <w:rFonts w:ascii="Arial" w:hAnsi="Arial" w:cs="Arial"/>
-          <w:sz w:val="24"/>
-          <w:szCs w:val="24"/>
-        </w:rPr>
-        <w:t xml:space="preserve">La implementación de la aplicación </w:t>
-      </w:r>
+          <w:sz w:val="24"/>
+          <w:szCs w:val="24"/>
+        </w:rPr>
+      </w:pPr>
     </w:p>
     <w:p>
       <w:pPr>
@@ -1612,8 +1880,552 @@
           <w:sz w:val="24"/>
           <w:szCs w:val="24"/>
         </w:rPr>
+        <w:t>Desarrollo e implementación incremental por etapas</w:t>
+      </w:r>
+    </w:p>
+    <w:p>
+      <w:pPr>
+        <w:pStyle w:val="Prrafodelista"/>
+        <w:ind w:left="792"/>
+        <w:jc w:val="both"/>
+        <w:rPr>
+          <w:rFonts w:ascii="Arial" w:hAnsi="Arial" w:cs="Arial"/>
+          <w:sz w:val="24"/>
+          <w:szCs w:val="24"/>
+        </w:rPr>
+      </w:pPr>
+      <w:r>
+        <w:rPr>
+          <w:rFonts w:ascii="Arial" w:hAnsi="Arial" w:cs="Arial"/>
+          <w:sz w:val="24"/>
+          <w:szCs w:val="24"/>
+        </w:rPr>
+        <w:t>El proyecto se construirá bajo un esquema iterativo, dividido en las siguientes fases técnicas:</w:t>
+      </w:r>
+    </w:p>
+    <w:p>
+      <w:pPr>
+        <w:pStyle w:val="Prrafodelista"/>
+        <w:numPr>
+          <w:ilvl w:val="0"/>
+          <w:numId w:val="9"/>
+        </w:numPr>
+        <w:jc w:val="both"/>
+        <w:rPr>
+          <w:rFonts w:ascii="Arial" w:hAnsi="Arial" w:cs="Arial"/>
+          <w:b/>
+          <w:sz w:val="24"/>
+          <w:szCs w:val="24"/>
+        </w:rPr>
+      </w:pPr>
+      <w:r>
+        <w:rPr>
+          <w:rFonts w:ascii="Arial" w:hAnsi="Arial" w:cs="Arial"/>
+          <w:b/>
+          <w:sz w:val="24"/>
+          <w:szCs w:val="24"/>
+        </w:rPr>
+        <w:t xml:space="preserve">Configuración del entorno virtual y rastreo: </w:t>
+      </w:r>
+      <w:r>
+        <w:rPr>
+          <w:rFonts w:ascii="Arial" w:hAnsi="Arial" w:cs="Arial"/>
+          <w:sz w:val="24"/>
+          <w:szCs w:val="24"/>
+        </w:rPr>
+        <w:t xml:space="preserve">Inicialización del proyecto en </w:t>
+      </w:r>
+      <w:proofErr w:type="spellStart"/>
+      <w:r>
+        <w:rPr>
+          <w:rFonts w:ascii="Arial" w:hAnsi="Arial" w:cs="Arial"/>
+          <w:i/>
+          <w:sz w:val="24"/>
+          <w:szCs w:val="24"/>
+        </w:rPr>
+        <w:t>Unity</w:t>
+      </w:r>
+      <w:proofErr w:type="spellEnd"/>
+      <w:r>
+        <w:rPr>
+          <w:rFonts w:ascii="Arial" w:hAnsi="Arial" w:cs="Arial"/>
+          <w:sz w:val="24"/>
+          <w:szCs w:val="24"/>
+        </w:rPr>
+        <w:t xml:space="preserve"> integrando los </w:t>
+      </w:r>
+      <w:proofErr w:type="spellStart"/>
+      <w:r>
+        <w:rPr>
+          <w:rFonts w:ascii="Arial" w:hAnsi="Arial" w:cs="Arial"/>
+          <w:i/>
+          <w:sz w:val="24"/>
+          <w:szCs w:val="24"/>
+        </w:rPr>
+        <w:t>building</w:t>
+      </w:r>
+      <w:proofErr w:type="spellEnd"/>
+      <w:r>
+        <w:rPr>
+          <w:rFonts w:ascii="Arial" w:hAnsi="Arial" w:cs="Arial"/>
+          <w:i/>
+          <w:sz w:val="24"/>
+          <w:szCs w:val="24"/>
+        </w:rPr>
+        <w:t xml:space="preserve"> blocks </w:t>
+      </w:r>
+      <w:r>
+        <w:rPr>
+          <w:rFonts w:ascii="Arial" w:hAnsi="Arial" w:cs="Arial"/>
+          <w:sz w:val="24"/>
+          <w:szCs w:val="24"/>
+        </w:rPr>
+        <w:t xml:space="preserve">de </w:t>
+      </w:r>
+      <w:r>
+        <w:rPr>
+          <w:rFonts w:ascii="Arial" w:hAnsi="Arial" w:cs="Arial"/>
+          <w:i/>
+          <w:sz w:val="24"/>
+          <w:szCs w:val="24"/>
+        </w:rPr>
+        <w:t>Meta XR Simulator</w:t>
+      </w:r>
+      <w:r>
+        <w:rPr>
+          <w:rFonts w:ascii="Arial" w:hAnsi="Arial" w:cs="Arial"/>
+          <w:sz w:val="24"/>
+          <w:szCs w:val="24"/>
+        </w:rPr>
+        <w:t xml:space="preserve"> para capturar y replicar los movimientos reales de las manos del usuario dentro del espacio tridimensional con alta precisión.</w:t>
+      </w:r>
+    </w:p>
+    <w:p>
+      <w:pPr>
+        <w:pStyle w:val="Prrafodelista"/>
+        <w:numPr>
+          <w:ilvl w:val="0"/>
+          <w:numId w:val="9"/>
+        </w:numPr>
+        <w:jc w:val="both"/>
+        <w:rPr>
+          <w:rFonts w:ascii="Arial" w:hAnsi="Arial" w:cs="Arial"/>
+          <w:b/>
+          <w:sz w:val="24"/>
+          <w:szCs w:val="24"/>
+        </w:rPr>
+      </w:pPr>
+      <w:r>
+        <w:rPr>
+          <w:rFonts w:ascii="Arial" w:hAnsi="Arial" w:cs="Arial"/>
+          <w:b/>
+          <w:sz w:val="24"/>
+          <w:szCs w:val="24"/>
+        </w:rPr>
+        <w:t xml:space="preserve">Módulo de calibración física: </w:t>
+      </w:r>
+      <w:r>
+        <w:rPr>
+          <w:rFonts w:ascii="Arial" w:hAnsi="Arial" w:cs="Arial"/>
+          <w:sz w:val="24"/>
+          <w:szCs w:val="24"/>
+        </w:rPr>
+        <w:t>Creación de un algoritmo que evalúe el rango de estiramiento y movimiento máximo del brazo no afectado, estableciendo los límites espaciales seguros para las dinámicas de la sesión.</w:t>
+      </w:r>
+    </w:p>
+    <w:p>
+      <w:pPr>
+        <w:pStyle w:val="Prrafodelista"/>
+        <w:numPr>
+          <w:ilvl w:val="0"/>
+          <w:numId w:val="9"/>
+        </w:numPr>
+        <w:jc w:val="both"/>
+        <w:rPr>
+          <w:rFonts w:ascii="Arial" w:hAnsi="Arial" w:cs="Arial"/>
+          <w:b/>
+          <w:sz w:val="24"/>
+          <w:szCs w:val="24"/>
+        </w:rPr>
+      </w:pPr>
+      <w:r>
+        <w:rPr>
+          <w:rFonts w:ascii="Arial" w:hAnsi="Arial" w:cs="Arial"/>
+          <w:b/>
+          <w:sz w:val="24"/>
+          <w:szCs w:val="24"/>
+        </w:rPr>
+        <w:t xml:space="preserve">Programación de mecánicas de juego: </w:t>
+      </w:r>
+      <w:r>
+        <w:rPr>
+          <w:rFonts w:ascii="Arial" w:hAnsi="Arial" w:cs="Arial"/>
+          <w:sz w:val="24"/>
+          <w:szCs w:val="24"/>
+        </w:rPr>
+        <w:t>Diseño y desarrollo de los 4 escenarios virtuales orientados a ejercitar la pronación, supinación, flexión y extensión, así como la movilidad del brazo en tres planos distintos.</w:t>
+      </w:r>
+    </w:p>
+    <w:p>
+      <w:pPr>
+        <w:pStyle w:val="Prrafodelista"/>
+        <w:numPr>
+          <w:ilvl w:val="0"/>
+          <w:numId w:val="9"/>
+        </w:numPr>
+        <w:jc w:val="both"/>
+        <w:rPr>
+          <w:rFonts w:ascii="Arial" w:hAnsi="Arial" w:cs="Arial"/>
+          <w:b/>
+          <w:sz w:val="24"/>
+          <w:szCs w:val="24"/>
+        </w:rPr>
+      </w:pPr>
+      <w:r>
+        <w:rPr>
+          <w:rFonts w:ascii="Arial" w:hAnsi="Arial" w:cs="Arial"/>
+          <w:b/>
+          <w:sz w:val="24"/>
+          <w:szCs w:val="24"/>
+        </w:rPr>
+        <w:t xml:space="preserve">Sistema de dificultad adaptativa: </w:t>
+      </w:r>
+      <w:r>
+        <w:rPr>
+          <w:rFonts w:ascii="Arial" w:hAnsi="Arial" w:cs="Arial"/>
+          <w:sz w:val="24"/>
+          <w:szCs w:val="24"/>
+        </w:rPr>
+        <w:t xml:space="preserve">Implementación de la lógica en </w:t>
+      </w:r>
+      <w:r>
+        <w:rPr>
+          <w:rFonts w:ascii="Arial" w:hAnsi="Arial" w:cs="Arial"/>
+          <w:i/>
+          <w:sz w:val="24"/>
+          <w:szCs w:val="24"/>
+        </w:rPr>
+        <w:t>C#</w:t>
+      </w:r>
+      <w:r>
+        <w:rPr>
+          <w:rFonts w:ascii="Arial" w:hAnsi="Arial" w:cs="Arial"/>
+          <w:sz w:val="24"/>
+          <w:szCs w:val="24"/>
+        </w:rPr>
+        <w:t xml:space="preserve"> que evalúe el desempeño del jugador en tiempo real para modificar dinámicamente la velocidad y el tiempo de aparición de los obstáculos.</w:t>
+      </w:r>
+    </w:p>
+    <w:p>
+      <w:pPr>
+        <w:pStyle w:val="Prrafodelista"/>
+        <w:numPr>
+          <w:ilvl w:val="0"/>
+          <w:numId w:val="9"/>
+        </w:numPr>
+        <w:jc w:val="both"/>
+        <w:rPr>
+          <w:rFonts w:ascii="Arial" w:hAnsi="Arial" w:cs="Arial"/>
+          <w:b/>
+          <w:sz w:val="24"/>
+          <w:szCs w:val="24"/>
+        </w:rPr>
+      </w:pPr>
+      <w:r>
+        <w:rPr>
+          <w:rFonts w:ascii="Arial" w:hAnsi="Arial" w:cs="Arial"/>
+          <w:b/>
+          <w:sz w:val="24"/>
+          <w:szCs w:val="24"/>
+        </w:rPr>
+        <w:t xml:space="preserve">Diseño de la interfaz Accesible (UI): </w:t>
+      </w:r>
+      <w:r>
+        <w:rPr>
+          <w:rFonts w:ascii="Arial" w:hAnsi="Arial" w:cs="Arial"/>
+          <w:sz w:val="24"/>
+          <w:szCs w:val="24"/>
+        </w:rPr>
+        <w:t xml:space="preserve">Construcción de menús e indicadores visuales </w:t>
+      </w:r>
+      <w:proofErr w:type="spellStart"/>
+      <w:r>
+        <w:rPr>
+          <w:rFonts w:ascii="Arial" w:hAnsi="Arial" w:cs="Arial"/>
+          <w:sz w:val="24"/>
+          <w:szCs w:val="24"/>
+        </w:rPr>
+        <w:t>interactuables</w:t>
+      </w:r>
+      <w:proofErr w:type="spellEnd"/>
+      <w:r>
+        <w:rPr>
+          <w:rFonts w:ascii="Arial" w:hAnsi="Arial" w:cs="Arial"/>
+          <w:sz w:val="24"/>
+          <w:szCs w:val="24"/>
+        </w:rPr>
+        <w:t xml:space="preserve"> exclusivamente mediante </w:t>
+      </w:r>
+      <w:proofErr w:type="spellStart"/>
+      <w:r>
+        <w:rPr>
+          <w:rFonts w:ascii="Arial" w:hAnsi="Arial" w:cs="Arial"/>
+          <w:i/>
+          <w:sz w:val="24"/>
+          <w:szCs w:val="24"/>
+        </w:rPr>
+        <w:t>poking</w:t>
+      </w:r>
+      <w:proofErr w:type="spellEnd"/>
+      <w:r>
+        <w:rPr>
+          <w:rFonts w:ascii="Arial" w:hAnsi="Arial" w:cs="Arial"/>
+          <w:sz w:val="24"/>
+          <w:szCs w:val="24"/>
+        </w:rPr>
+        <w:t xml:space="preserve">, priorizando un diseño limpio que prevenga la fatiga sensorial y la </w:t>
+      </w:r>
+      <w:proofErr w:type="spellStart"/>
+      <w:r>
+        <w:rPr>
+          <w:rFonts w:ascii="Arial" w:hAnsi="Arial" w:cs="Arial"/>
+          <w:sz w:val="24"/>
+          <w:szCs w:val="24"/>
+        </w:rPr>
+        <w:t>sobreestimulación</w:t>
+      </w:r>
+      <w:proofErr w:type="spellEnd"/>
+      <w:r>
+        <w:rPr>
+          <w:rFonts w:ascii="Arial" w:hAnsi="Arial" w:cs="Arial"/>
+          <w:sz w:val="24"/>
+          <w:szCs w:val="24"/>
+        </w:rPr>
+        <w:t xml:space="preserve"> del paciente.</w:t>
+      </w:r>
+    </w:p>
+    <w:p>
+      <w:pPr>
+        <w:pStyle w:val="Prrafodelista"/>
+        <w:ind w:left="1512"/>
+        <w:jc w:val="both"/>
+        <w:rPr>
+          <w:rFonts w:ascii="Arial" w:hAnsi="Arial" w:cs="Arial"/>
+          <w:b/>
+          <w:sz w:val="24"/>
+          <w:szCs w:val="24"/>
+        </w:rPr>
+      </w:pPr>
+    </w:p>
+    <w:p>
+      <w:pPr>
+        <w:pStyle w:val="Prrafodelista"/>
+        <w:numPr>
+          <w:ilvl w:val="1"/>
+          <w:numId w:val="7"/>
+        </w:numPr>
+        <w:jc w:val="both"/>
+        <w:rPr>
+          <w:rFonts w:ascii="Arial" w:hAnsi="Arial" w:cs="Arial"/>
+          <w:b/>
+          <w:sz w:val="24"/>
+          <w:szCs w:val="24"/>
+        </w:rPr>
+      </w:pPr>
+      <w:r>
+        <w:rPr>
+          <w:rFonts w:ascii="Arial" w:hAnsi="Arial" w:cs="Arial"/>
+          <w:b/>
+          <w:sz w:val="24"/>
+          <w:szCs w:val="24"/>
+        </w:rPr>
         <w:t>Pruebas</w:t>
       </w:r>
+    </w:p>
+    <w:p>
+      <w:pPr>
+        <w:pStyle w:val="Prrafodelista"/>
+        <w:ind w:left="792"/>
+        <w:jc w:val="both"/>
+        <w:rPr>
+          <w:rFonts w:ascii="Arial" w:hAnsi="Arial" w:cs="Arial"/>
+          <w:sz w:val="24"/>
+          <w:szCs w:val="24"/>
+        </w:rPr>
+      </w:pPr>
+      <w:r>
+        <w:rPr>
+          <w:rFonts w:ascii="Arial" w:hAnsi="Arial" w:cs="Arial"/>
+          <w:sz w:val="24"/>
+          <w:szCs w:val="24"/>
+        </w:rPr>
+        <w:t>Al finalizar la integración de los módulos, se llevarán a cabo evaluaciones exhaustivas para validar el sistema:</w:t>
+      </w:r>
+    </w:p>
+    <w:p>
+      <w:pPr>
+        <w:pStyle w:val="Prrafodelista"/>
+        <w:numPr>
+          <w:ilvl w:val="0"/>
+          <w:numId w:val="10"/>
+        </w:numPr>
+        <w:jc w:val="both"/>
+        <w:rPr>
+          <w:rFonts w:ascii="Arial" w:hAnsi="Arial" w:cs="Arial"/>
+          <w:sz w:val="24"/>
+          <w:szCs w:val="24"/>
+        </w:rPr>
+      </w:pPr>
+      <w:r>
+        <w:rPr>
+          <w:rFonts w:ascii="Arial" w:hAnsi="Arial" w:cs="Arial"/>
+          <w:b/>
+          <w:sz w:val="24"/>
+          <w:szCs w:val="24"/>
+        </w:rPr>
+        <w:t xml:space="preserve">Pruebas de usabilidad y seguimiento óptico: </w:t>
+      </w:r>
+      <w:r>
+        <w:rPr>
+          <w:rFonts w:ascii="Arial" w:hAnsi="Arial" w:cs="Arial"/>
+          <w:sz w:val="24"/>
+          <w:szCs w:val="24"/>
+        </w:rPr>
+        <w:t xml:space="preserve">Verificación de la precisión del </w:t>
+      </w:r>
+      <w:proofErr w:type="spellStart"/>
+      <w:r>
+        <w:rPr>
+          <w:rFonts w:ascii="Arial" w:hAnsi="Arial" w:cs="Arial"/>
+          <w:i/>
+          <w:sz w:val="24"/>
+          <w:szCs w:val="24"/>
+        </w:rPr>
+        <w:t>hand</w:t>
+      </w:r>
+      <w:proofErr w:type="spellEnd"/>
+      <w:r>
+        <w:rPr>
+          <w:rFonts w:ascii="Arial" w:hAnsi="Arial" w:cs="Arial"/>
+          <w:i/>
+          <w:sz w:val="24"/>
+          <w:szCs w:val="24"/>
+        </w:rPr>
+        <w:t xml:space="preserve"> tracking</w:t>
+      </w:r>
+      <w:r>
+        <w:rPr>
+          <w:rFonts w:ascii="Arial" w:hAnsi="Arial" w:cs="Arial"/>
+          <w:sz w:val="24"/>
+          <w:szCs w:val="24"/>
+        </w:rPr>
+        <w:t xml:space="preserve"> en distintos ángulos y velocidades de movimiento, asegurando que la respuesta del sistema a través de la conexión </w:t>
+      </w:r>
+      <w:r>
+        <w:rPr>
+          <w:rFonts w:ascii="Arial" w:hAnsi="Arial" w:cs="Arial"/>
+          <w:i/>
+          <w:sz w:val="24"/>
+          <w:szCs w:val="24"/>
+        </w:rPr>
+        <w:t>USB</w:t>
+      </w:r>
+      <w:r>
+        <w:rPr>
+          <w:rFonts w:ascii="Arial" w:hAnsi="Arial" w:cs="Arial"/>
+          <w:sz w:val="24"/>
+          <w:szCs w:val="24"/>
+        </w:rPr>
+        <w:t xml:space="preserve"> sea fluida y sin interrupciones.</w:t>
+      </w:r>
+    </w:p>
+    <w:p>
+      <w:pPr>
+        <w:pStyle w:val="Prrafodelista"/>
+        <w:numPr>
+          <w:ilvl w:val="0"/>
+          <w:numId w:val="10"/>
+        </w:numPr>
+        <w:jc w:val="both"/>
+        <w:rPr>
+          <w:rFonts w:ascii="Arial" w:hAnsi="Arial" w:cs="Arial"/>
+          <w:sz w:val="24"/>
+          <w:szCs w:val="24"/>
+        </w:rPr>
+      </w:pPr>
+      <w:r>
+        <w:rPr>
+          <w:rFonts w:ascii="Arial" w:hAnsi="Arial" w:cs="Arial"/>
+          <w:b/>
+          <w:sz w:val="24"/>
+          <w:szCs w:val="24"/>
+        </w:rPr>
+        <w:t>Pruebas de confort y seguridad:</w:t>
+      </w:r>
+      <w:r>
+        <w:rPr>
+          <w:rFonts w:ascii="Arial" w:hAnsi="Arial" w:cs="Arial"/>
+          <w:sz w:val="24"/>
+          <w:szCs w:val="24"/>
+        </w:rPr>
+        <w:t xml:space="preserve"> Validación de que las mecánicas de los 4 </w:t>
+      </w:r>
+      <w:proofErr w:type="spellStart"/>
+      <w:r>
+        <w:rPr>
+          <w:rFonts w:ascii="Arial" w:hAnsi="Arial" w:cs="Arial"/>
+          <w:sz w:val="24"/>
+          <w:szCs w:val="24"/>
+        </w:rPr>
+        <w:t>minijuegos</w:t>
+      </w:r>
+      <w:proofErr w:type="spellEnd"/>
+      <w:r>
+        <w:rPr>
+          <w:rFonts w:ascii="Arial" w:hAnsi="Arial" w:cs="Arial"/>
+          <w:sz w:val="24"/>
+          <w:szCs w:val="24"/>
+        </w:rPr>
+        <w:t xml:space="preserve"> no exijan al usuario movimientos más allá de los parámetros </w:t>
+      </w:r>
+      <w:r>
+        <w:rPr>
+          <w:rFonts w:ascii="Arial" w:hAnsi="Arial" w:cs="Arial"/>
+          <w:sz w:val="24"/>
+          <w:szCs w:val="24"/>
+        </w:rPr>
+        <w:lastRenderedPageBreak/>
+        <w:t xml:space="preserve">calibrados en su brazo sano, y que la experiencia </w:t>
+      </w:r>
+      <w:proofErr w:type="spellStart"/>
+      <w:r>
+        <w:rPr>
+          <w:rFonts w:ascii="Arial" w:hAnsi="Arial" w:cs="Arial"/>
+          <w:sz w:val="24"/>
+          <w:szCs w:val="24"/>
+        </w:rPr>
+        <w:t>inmersiva</w:t>
+      </w:r>
+      <w:proofErr w:type="spellEnd"/>
+      <w:r>
+        <w:rPr>
+          <w:rFonts w:ascii="Arial" w:hAnsi="Arial" w:cs="Arial"/>
+          <w:sz w:val="24"/>
+          <w:szCs w:val="24"/>
+        </w:rPr>
+        <w:t xml:space="preserve"> no induzca desorientación o estrés visual.</w:t>
+      </w:r>
+    </w:p>
+    <w:p>
+      <w:pPr>
+        <w:jc w:val="both"/>
+        <w:rPr>
+          <w:rFonts w:ascii="Arial" w:hAnsi="Arial" w:cs="Arial"/>
+          <w:b/>
+          <w:sz w:val="24"/>
+          <w:szCs w:val="24"/>
+        </w:rPr>
+      </w:pPr>
     </w:p>
     <w:p>
       <w:pPr>
@@ -1643,6 +2455,814 @@
     <w:p>
       <w:pPr>
         <w:pStyle w:val="Prrafodelista"/>
+        <w:ind w:left="360"/>
+        <w:jc w:val="both"/>
+        <w:rPr>
+          <w:rFonts w:ascii="Arial" w:hAnsi="Arial" w:cs="Arial"/>
+          <w:b/>
+          <w:sz w:val="24"/>
+          <w:szCs w:val="24"/>
+        </w:rPr>
+      </w:pPr>
+    </w:p>
+    <w:p>
+      <w:pPr>
+        <w:pStyle w:val="Prrafodelista"/>
+        <w:numPr>
+          <w:ilvl w:val="0"/>
+          <w:numId w:val="12"/>
+        </w:numPr>
+        <w:jc w:val="both"/>
+        <w:rPr>
+          <w:rFonts w:ascii="Arial" w:hAnsi="Arial" w:cs="Arial"/>
+          <w:b/>
+          <w:sz w:val="24"/>
+          <w:szCs w:val="24"/>
+        </w:rPr>
+      </w:pPr>
+      <w:r>
+        <w:rPr>
+          <w:rFonts w:ascii="Arial" w:hAnsi="Arial" w:cs="Arial"/>
+          <w:sz w:val="24"/>
+          <w:szCs w:val="24"/>
+        </w:rPr>
+        <w:t>Introducción</w:t>
+      </w:r>
+    </w:p>
+    <w:p>
+      <w:pPr>
+        <w:pStyle w:val="Prrafodelista"/>
+        <w:numPr>
+          <w:ilvl w:val="1"/>
+          <w:numId w:val="12"/>
+        </w:numPr>
+        <w:jc w:val="both"/>
+        <w:rPr>
+          <w:rFonts w:ascii="Arial" w:hAnsi="Arial" w:cs="Arial"/>
+          <w:b/>
+          <w:sz w:val="24"/>
+          <w:szCs w:val="24"/>
+        </w:rPr>
+      </w:pPr>
+      <w:r>
+        <w:rPr>
+          <w:rFonts w:ascii="Arial" w:hAnsi="Arial" w:cs="Arial"/>
+          <w:sz w:val="24"/>
+          <w:szCs w:val="24"/>
+        </w:rPr>
+        <w:t xml:space="preserve"> Objetivos</w:t>
+      </w:r>
+    </w:p>
+    <w:p>
+      <w:pPr>
+        <w:pStyle w:val="Prrafodelista"/>
+        <w:numPr>
+          <w:ilvl w:val="1"/>
+          <w:numId w:val="12"/>
+        </w:numPr>
+        <w:jc w:val="both"/>
+        <w:rPr>
+          <w:rFonts w:ascii="Arial" w:hAnsi="Arial" w:cs="Arial"/>
+          <w:b/>
+          <w:sz w:val="24"/>
+          <w:szCs w:val="24"/>
+        </w:rPr>
+      </w:pPr>
+      <w:r>
+        <w:rPr>
+          <w:rFonts w:ascii="Arial" w:hAnsi="Arial" w:cs="Arial"/>
+          <w:sz w:val="24"/>
+          <w:szCs w:val="24"/>
+        </w:rPr>
+        <w:t xml:space="preserve"> Métodos</w:t>
+      </w:r>
+    </w:p>
+    <w:p>
+      <w:pPr>
+        <w:pStyle w:val="Prrafodelista"/>
+        <w:numPr>
+          <w:ilvl w:val="1"/>
+          <w:numId w:val="12"/>
+        </w:numPr>
+        <w:jc w:val="both"/>
+        <w:rPr>
+          <w:rFonts w:ascii="Arial" w:hAnsi="Arial" w:cs="Arial"/>
+          <w:b/>
+          <w:sz w:val="24"/>
+          <w:szCs w:val="24"/>
+        </w:rPr>
+      </w:pPr>
+      <w:r>
+        <w:rPr>
+          <w:rFonts w:ascii="Arial" w:hAnsi="Arial" w:cs="Arial"/>
+          <w:sz w:val="24"/>
+          <w:szCs w:val="24"/>
+        </w:rPr>
+        <w:t xml:space="preserve"> Estructura del trabajo</w:t>
+      </w:r>
+    </w:p>
+    <w:p>
+      <w:pPr>
+        <w:pStyle w:val="Prrafodelista"/>
+        <w:numPr>
+          <w:ilvl w:val="0"/>
+          <w:numId w:val="12"/>
+        </w:numPr>
+        <w:jc w:val="both"/>
+        <w:rPr>
+          <w:rFonts w:ascii="Arial" w:hAnsi="Arial" w:cs="Arial"/>
+          <w:b/>
+          <w:sz w:val="24"/>
+          <w:szCs w:val="24"/>
+        </w:rPr>
+      </w:pPr>
+      <w:r>
+        <w:rPr>
+          <w:rFonts w:ascii="Arial" w:hAnsi="Arial" w:cs="Arial"/>
+          <w:sz w:val="24"/>
+          <w:szCs w:val="24"/>
+        </w:rPr>
+        <w:t>Evento Vascular Cerebral</w:t>
+      </w:r>
+    </w:p>
+    <w:p>
+      <w:pPr>
+        <w:pStyle w:val="Prrafodelista"/>
+        <w:numPr>
+          <w:ilvl w:val="1"/>
+          <w:numId w:val="12"/>
+        </w:numPr>
+        <w:jc w:val="both"/>
+        <w:rPr>
+          <w:rFonts w:ascii="Arial" w:hAnsi="Arial" w:cs="Arial"/>
+          <w:b/>
+          <w:sz w:val="24"/>
+          <w:szCs w:val="24"/>
+        </w:rPr>
+      </w:pPr>
+      <w:r>
+        <w:rPr>
+          <w:rFonts w:ascii="Arial" w:hAnsi="Arial" w:cs="Arial"/>
+          <w:b/>
+          <w:sz w:val="24"/>
+          <w:szCs w:val="24"/>
+        </w:rPr>
+        <w:t xml:space="preserve"> </w:t>
+      </w:r>
+      <w:r>
+        <w:rPr>
+          <w:rFonts w:ascii="Arial" w:hAnsi="Arial" w:cs="Arial"/>
+          <w:sz w:val="24"/>
+          <w:szCs w:val="24"/>
+        </w:rPr>
+        <w:t>Definición</w:t>
+      </w:r>
+    </w:p>
+    <w:p>
+      <w:pPr>
+        <w:pStyle w:val="Prrafodelista"/>
+        <w:numPr>
+          <w:ilvl w:val="1"/>
+          <w:numId w:val="12"/>
+        </w:numPr>
+        <w:jc w:val="both"/>
+        <w:rPr>
+          <w:rFonts w:ascii="Arial" w:hAnsi="Arial" w:cs="Arial"/>
+          <w:b/>
+          <w:sz w:val="24"/>
+          <w:szCs w:val="24"/>
+        </w:rPr>
+      </w:pPr>
+      <w:r>
+        <w:rPr>
+          <w:rFonts w:ascii="Arial" w:hAnsi="Arial" w:cs="Arial"/>
+          <w:sz w:val="24"/>
+          <w:szCs w:val="24"/>
+        </w:rPr>
+        <w:t xml:space="preserve"> </w:t>
+      </w:r>
+      <w:r>
+        <w:rPr>
+          <w:rFonts w:ascii="Arial" w:hAnsi="Arial" w:cs="Arial"/>
+          <w:sz w:val="24"/>
+          <w:szCs w:val="24"/>
+        </w:rPr>
+        <w:t>Déficits motores</w:t>
+      </w:r>
+    </w:p>
+    <w:p>
+      <w:pPr>
+        <w:pStyle w:val="Prrafodelista"/>
+        <w:numPr>
+          <w:ilvl w:val="1"/>
+          <w:numId w:val="12"/>
+        </w:numPr>
+        <w:jc w:val="both"/>
+        <w:rPr>
+          <w:rFonts w:ascii="Arial" w:hAnsi="Arial" w:cs="Arial"/>
+          <w:b/>
+          <w:sz w:val="24"/>
+          <w:szCs w:val="24"/>
+        </w:rPr>
+      </w:pPr>
+      <w:r>
+        <w:rPr>
+          <w:rFonts w:ascii="Arial" w:hAnsi="Arial" w:cs="Arial"/>
+          <w:sz w:val="24"/>
+          <w:szCs w:val="24"/>
+        </w:rPr>
+        <w:t xml:space="preserve"> Rehabilitación</w:t>
+      </w:r>
+    </w:p>
+    <w:p>
+      <w:pPr>
+        <w:pStyle w:val="Prrafodelista"/>
+        <w:numPr>
+          <w:ilvl w:val="0"/>
+          <w:numId w:val="12"/>
+        </w:numPr>
+        <w:jc w:val="both"/>
+        <w:rPr>
+          <w:rFonts w:ascii="Arial" w:hAnsi="Arial" w:cs="Arial"/>
+          <w:b/>
+          <w:sz w:val="24"/>
+          <w:szCs w:val="24"/>
+        </w:rPr>
+      </w:pPr>
+      <w:r>
+        <w:rPr>
+          <w:rFonts w:ascii="Arial" w:hAnsi="Arial" w:cs="Arial"/>
+          <w:sz w:val="24"/>
+          <w:szCs w:val="24"/>
+        </w:rPr>
+        <w:t>Sistemas de Rehabilitación Virtual</w:t>
+      </w:r>
+    </w:p>
+    <w:p>
+      <w:pPr>
+        <w:pStyle w:val="Prrafodelista"/>
+        <w:numPr>
+          <w:ilvl w:val="1"/>
+          <w:numId w:val="12"/>
+        </w:numPr>
+        <w:jc w:val="both"/>
+        <w:rPr>
+          <w:rFonts w:ascii="Arial" w:hAnsi="Arial" w:cs="Arial"/>
+          <w:b/>
+          <w:sz w:val="24"/>
+          <w:szCs w:val="24"/>
+        </w:rPr>
+      </w:pPr>
+      <w:r>
+        <w:rPr>
+          <w:rFonts w:ascii="Arial" w:hAnsi="Arial" w:cs="Arial"/>
+          <w:sz w:val="24"/>
+          <w:szCs w:val="24"/>
+        </w:rPr>
+        <w:t xml:space="preserve"> Definición</w:t>
+      </w:r>
+    </w:p>
+    <w:p>
+      <w:pPr>
+        <w:pStyle w:val="Prrafodelista"/>
+        <w:numPr>
+          <w:ilvl w:val="1"/>
+          <w:numId w:val="12"/>
+        </w:numPr>
+        <w:jc w:val="both"/>
+        <w:rPr>
+          <w:rFonts w:ascii="Arial" w:hAnsi="Arial" w:cs="Arial"/>
+          <w:b/>
+          <w:sz w:val="24"/>
+          <w:szCs w:val="24"/>
+        </w:rPr>
+      </w:pPr>
+      <w:r>
+        <w:rPr>
+          <w:rFonts w:ascii="Arial" w:hAnsi="Arial" w:cs="Arial"/>
+          <w:sz w:val="24"/>
+          <w:szCs w:val="24"/>
+        </w:rPr>
+        <w:t xml:space="preserve"> Inmersión y Hand Tracking en la rehabilitación</w:t>
+      </w:r>
+    </w:p>
+    <w:p>
+      <w:pPr>
+        <w:pStyle w:val="Prrafodelista"/>
+        <w:numPr>
+          <w:ilvl w:val="0"/>
+          <w:numId w:val="12"/>
+        </w:numPr>
+        <w:jc w:val="both"/>
+        <w:rPr>
+          <w:rFonts w:ascii="Arial" w:hAnsi="Arial" w:cs="Arial"/>
+          <w:b/>
+          <w:sz w:val="24"/>
+          <w:szCs w:val="24"/>
+        </w:rPr>
+      </w:pPr>
+      <w:r>
+        <w:rPr>
+          <w:rFonts w:ascii="Arial" w:hAnsi="Arial" w:cs="Arial"/>
+          <w:sz w:val="24"/>
+          <w:szCs w:val="24"/>
+        </w:rPr>
+        <w:t>Diseño y desarrollo de la aplicación interactiva</w:t>
+      </w:r>
+    </w:p>
+    <w:p>
+      <w:pPr>
+        <w:pStyle w:val="Prrafodelista"/>
+        <w:numPr>
+          <w:ilvl w:val="1"/>
+          <w:numId w:val="12"/>
+        </w:numPr>
+        <w:jc w:val="both"/>
+        <w:rPr>
+          <w:rFonts w:ascii="Arial" w:hAnsi="Arial" w:cs="Arial"/>
+          <w:b/>
+          <w:sz w:val="24"/>
+          <w:szCs w:val="24"/>
+        </w:rPr>
+      </w:pPr>
+      <w:r>
+        <w:rPr>
+          <w:rFonts w:ascii="Arial" w:hAnsi="Arial" w:cs="Arial"/>
+          <w:sz w:val="24"/>
+          <w:szCs w:val="24"/>
+        </w:rPr>
+        <w:t xml:space="preserve"> </w:t>
+      </w:r>
+      <w:proofErr w:type="spellStart"/>
+      <w:r>
+        <w:rPr>
+          <w:rFonts w:ascii="Arial" w:hAnsi="Arial" w:cs="Arial"/>
+          <w:sz w:val="24"/>
+          <w:szCs w:val="24"/>
+        </w:rPr>
+        <w:t>Unity</w:t>
+      </w:r>
+      <w:proofErr w:type="spellEnd"/>
+    </w:p>
+    <w:p>
+      <w:pPr>
+        <w:pStyle w:val="Prrafodelista"/>
+        <w:numPr>
+          <w:ilvl w:val="1"/>
+          <w:numId w:val="12"/>
+        </w:numPr>
+        <w:jc w:val="both"/>
+        <w:rPr>
+          <w:rFonts w:ascii="Arial" w:hAnsi="Arial" w:cs="Arial"/>
+          <w:b/>
+          <w:sz w:val="24"/>
+          <w:szCs w:val="24"/>
+        </w:rPr>
+      </w:pPr>
+      <w:r>
+        <w:rPr>
+          <w:rFonts w:ascii="Arial" w:hAnsi="Arial" w:cs="Arial"/>
+          <w:sz w:val="24"/>
+          <w:szCs w:val="24"/>
+        </w:rPr>
+        <w:t xml:space="preserve"> C#</w:t>
+      </w:r>
+    </w:p>
+    <w:p>
+      <w:pPr>
+        <w:pStyle w:val="Prrafodelista"/>
+        <w:numPr>
+          <w:ilvl w:val="1"/>
+          <w:numId w:val="12"/>
+        </w:numPr>
+        <w:jc w:val="both"/>
+        <w:rPr>
+          <w:rFonts w:ascii="Arial" w:hAnsi="Arial" w:cs="Arial"/>
+          <w:b/>
+          <w:sz w:val="24"/>
+          <w:szCs w:val="24"/>
+        </w:rPr>
+      </w:pPr>
+      <w:r>
+        <w:rPr>
+          <w:rFonts w:ascii="Arial" w:hAnsi="Arial" w:cs="Arial"/>
+          <w:sz w:val="24"/>
+          <w:szCs w:val="24"/>
+        </w:rPr>
+        <w:t xml:space="preserve"> </w:t>
+      </w:r>
+      <w:r>
+        <w:rPr>
+          <w:rFonts w:ascii="Arial" w:hAnsi="Arial" w:cs="Arial"/>
+          <w:sz w:val="24"/>
+          <w:szCs w:val="24"/>
+        </w:rPr>
+        <w:t xml:space="preserve">Meta </w:t>
+      </w:r>
+      <w:proofErr w:type="spellStart"/>
+      <w:r>
+        <w:rPr>
+          <w:rFonts w:ascii="Arial" w:hAnsi="Arial" w:cs="Arial"/>
+          <w:sz w:val="24"/>
+          <w:szCs w:val="24"/>
+        </w:rPr>
+        <w:t>Quest</w:t>
+      </w:r>
+      <w:proofErr w:type="spellEnd"/>
+      <w:r>
+        <w:rPr>
+          <w:rFonts w:ascii="Arial" w:hAnsi="Arial" w:cs="Arial"/>
+          <w:sz w:val="24"/>
+          <w:szCs w:val="24"/>
+        </w:rPr>
+        <w:t xml:space="preserve"> 3S y Meta XR Simulator</w:t>
+      </w:r>
+    </w:p>
+    <w:p>
+      <w:pPr>
+        <w:pStyle w:val="Prrafodelista"/>
+        <w:numPr>
+          <w:ilvl w:val="1"/>
+          <w:numId w:val="12"/>
+        </w:numPr>
+        <w:jc w:val="both"/>
+        <w:rPr>
+          <w:rFonts w:ascii="Arial" w:hAnsi="Arial" w:cs="Arial"/>
+          <w:b/>
+          <w:sz w:val="24"/>
+          <w:szCs w:val="24"/>
+        </w:rPr>
+      </w:pPr>
+      <w:r>
+        <w:rPr>
+          <w:rFonts w:ascii="Arial" w:hAnsi="Arial" w:cs="Arial"/>
+          <w:sz w:val="24"/>
+          <w:szCs w:val="24"/>
+        </w:rPr>
+        <w:t xml:space="preserve"> Calibración en base al brazo sano</w:t>
+      </w:r>
+    </w:p>
+    <w:p>
+      <w:pPr>
+        <w:pStyle w:val="Prrafodelista"/>
+        <w:numPr>
+          <w:ilvl w:val="1"/>
+          <w:numId w:val="12"/>
+        </w:numPr>
+        <w:jc w:val="both"/>
+        <w:rPr>
+          <w:rFonts w:ascii="Arial" w:hAnsi="Arial" w:cs="Arial"/>
+          <w:b/>
+          <w:sz w:val="24"/>
+          <w:szCs w:val="24"/>
+        </w:rPr>
+      </w:pPr>
+      <w:r>
+        <w:rPr>
+          <w:rFonts w:ascii="Arial" w:hAnsi="Arial" w:cs="Arial"/>
+          <w:sz w:val="24"/>
+          <w:szCs w:val="24"/>
+        </w:rPr>
+        <w:t xml:space="preserve"> Mecánicas de los 4 </w:t>
+      </w:r>
+      <w:proofErr w:type="spellStart"/>
+      <w:r>
+        <w:rPr>
+          <w:rFonts w:ascii="Arial" w:hAnsi="Arial" w:cs="Arial"/>
+          <w:sz w:val="24"/>
+          <w:szCs w:val="24"/>
+        </w:rPr>
+        <w:t>minijuegos</w:t>
+      </w:r>
+      <w:proofErr w:type="spellEnd"/>
+    </w:p>
+    <w:p>
+      <w:pPr>
+        <w:pStyle w:val="Prrafodelista"/>
+        <w:numPr>
+          <w:ilvl w:val="1"/>
+          <w:numId w:val="12"/>
+        </w:numPr>
+        <w:jc w:val="both"/>
+        <w:rPr>
+          <w:rFonts w:ascii="Arial" w:hAnsi="Arial" w:cs="Arial"/>
+          <w:b/>
+          <w:sz w:val="24"/>
+          <w:szCs w:val="24"/>
+        </w:rPr>
+      </w:pPr>
+      <w:r>
+        <w:rPr>
+          <w:rFonts w:ascii="Arial" w:hAnsi="Arial" w:cs="Arial"/>
+          <w:sz w:val="24"/>
+          <w:szCs w:val="24"/>
+        </w:rPr>
+        <w:t xml:space="preserve"> </w:t>
+      </w:r>
+      <w:r>
+        <w:rPr>
+          <w:rFonts w:ascii="Arial" w:hAnsi="Arial" w:cs="Arial"/>
+          <w:sz w:val="24"/>
+          <w:szCs w:val="24"/>
+        </w:rPr>
+        <w:t xml:space="preserve">Interfaz de usuario (UI) mediante </w:t>
+      </w:r>
+      <w:proofErr w:type="spellStart"/>
+      <w:r>
+        <w:rPr>
+          <w:rFonts w:ascii="Arial" w:hAnsi="Arial" w:cs="Arial"/>
+          <w:sz w:val="24"/>
+          <w:szCs w:val="24"/>
+        </w:rPr>
+        <w:t>poking</w:t>
+      </w:r>
+      <w:proofErr w:type="spellEnd"/>
+    </w:p>
+    <w:p>
+      <w:pPr>
+        <w:pStyle w:val="Prrafodelista"/>
+        <w:numPr>
+          <w:ilvl w:val="1"/>
+          <w:numId w:val="12"/>
+        </w:numPr>
+        <w:jc w:val="both"/>
+        <w:rPr>
+          <w:rFonts w:ascii="Arial" w:hAnsi="Arial" w:cs="Arial"/>
+          <w:b/>
+          <w:sz w:val="24"/>
+          <w:szCs w:val="24"/>
+        </w:rPr>
+      </w:pPr>
+      <w:r>
+        <w:rPr>
+          <w:rFonts w:ascii="Arial" w:hAnsi="Arial" w:cs="Arial"/>
+          <w:sz w:val="24"/>
+          <w:szCs w:val="24"/>
+        </w:rPr>
+        <w:t xml:space="preserve"> </w:t>
+      </w:r>
+      <w:r>
+        <w:rPr>
+          <w:rFonts w:ascii="Arial" w:hAnsi="Arial" w:cs="Arial"/>
+          <w:sz w:val="24"/>
+          <w:szCs w:val="24"/>
+        </w:rPr>
+        <w:t>Implementación</w:t>
+      </w:r>
+    </w:p>
+    <w:p>
+      <w:pPr>
+        <w:pStyle w:val="Prrafodelista"/>
+        <w:numPr>
+          <w:ilvl w:val="0"/>
+          <w:numId w:val="12"/>
+        </w:numPr>
+        <w:jc w:val="both"/>
+        <w:rPr>
+          <w:rFonts w:ascii="Arial" w:hAnsi="Arial" w:cs="Arial"/>
+          <w:b/>
+          <w:sz w:val="24"/>
+          <w:szCs w:val="24"/>
+        </w:rPr>
+      </w:pPr>
+      <w:r>
+        <w:rPr>
+          <w:rFonts w:ascii="Arial" w:hAnsi="Arial" w:cs="Arial"/>
+          <w:sz w:val="24"/>
+          <w:szCs w:val="24"/>
+        </w:rPr>
+        <w:t>Operación del sistema</w:t>
+      </w:r>
+    </w:p>
+    <w:p>
+      <w:pPr>
+        <w:pStyle w:val="Prrafodelista"/>
+        <w:numPr>
+          <w:ilvl w:val="1"/>
+          <w:numId w:val="12"/>
+        </w:numPr>
+        <w:jc w:val="both"/>
+        <w:rPr>
+          <w:rFonts w:ascii="Arial" w:hAnsi="Arial" w:cs="Arial"/>
+          <w:b/>
+          <w:sz w:val="24"/>
+          <w:szCs w:val="24"/>
+        </w:rPr>
+      </w:pPr>
+      <w:r>
+        <w:rPr>
+          <w:rFonts w:ascii="Arial" w:hAnsi="Arial" w:cs="Arial"/>
+          <w:sz w:val="24"/>
+          <w:szCs w:val="24"/>
+        </w:rPr>
+        <w:t xml:space="preserve"> Interfaz de usuarios</w:t>
+      </w:r>
+    </w:p>
+    <w:p>
+      <w:pPr>
+        <w:pStyle w:val="Prrafodelista"/>
+        <w:numPr>
+          <w:ilvl w:val="1"/>
+          <w:numId w:val="12"/>
+        </w:numPr>
+        <w:jc w:val="both"/>
+        <w:rPr>
+          <w:rFonts w:ascii="Arial" w:hAnsi="Arial" w:cs="Arial"/>
+          <w:b/>
+          <w:sz w:val="24"/>
+          <w:szCs w:val="24"/>
+        </w:rPr>
+      </w:pPr>
+      <w:r>
+        <w:rPr>
+          <w:rFonts w:ascii="Arial" w:hAnsi="Arial" w:cs="Arial"/>
+          <w:sz w:val="24"/>
+          <w:szCs w:val="24"/>
+        </w:rPr>
+        <w:t xml:space="preserve"> Opciones de configuración</w:t>
+      </w:r>
+    </w:p>
+    <w:p>
+      <w:pPr>
+        <w:pStyle w:val="Prrafodelista"/>
+        <w:numPr>
+          <w:ilvl w:val="1"/>
+          <w:numId w:val="12"/>
+        </w:numPr>
+        <w:jc w:val="both"/>
+        <w:rPr>
+          <w:rFonts w:ascii="Arial" w:hAnsi="Arial" w:cs="Arial"/>
+          <w:b/>
+          <w:sz w:val="24"/>
+          <w:szCs w:val="24"/>
+        </w:rPr>
+      </w:pPr>
+      <w:r>
+        <w:rPr>
+          <w:rFonts w:ascii="Arial" w:hAnsi="Arial" w:cs="Arial"/>
+          <w:sz w:val="24"/>
+          <w:szCs w:val="24"/>
+        </w:rPr>
+        <w:t>Interacción con el jugador</w:t>
+      </w:r>
+    </w:p>
+    <w:p>
+      <w:pPr>
+        <w:pStyle w:val="Prrafodelista"/>
+        <w:numPr>
+          <w:ilvl w:val="1"/>
+          <w:numId w:val="12"/>
+        </w:numPr>
+        <w:jc w:val="both"/>
+        <w:rPr>
+          <w:rFonts w:ascii="Arial" w:hAnsi="Arial" w:cs="Arial"/>
+          <w:b/>
+          <w:sz w:val="24"/>
+          <w:szCs w:val="24"/>
+        </w:rPr>
+      </w:pPr>
+      <w:r>
+        <w:rPr>
+          <w:rFonts w:ascii="Arial" w:hAnsi="Arial" w:cs="Arial"/>
+          <w:sz w:val="24"/>
+          <w:szCs w:val="24"/>
+        </w:rPr>
+        <w:t>Pruebas con usuarios</w:t>
+      </w:r>
+    </w:p>
+    <w:p>
+      <w:pPr>
+        <w:pStyle w:val="Prrafodelista"/>
+        <w:numPr>
+          <w:ilvl w:val="0"/>
+          <w:numId w:val="12"/>
+        </w:numPr>
+        <w:jc w:val="both"/>
+        <w:rPr>
+          <w:rFonts w:ascii="Arial" w:hAnsi="Arial" w:cs="Arial"/>
+          <w:b/>
+          <w:sz w:val="24"/>
+          <w:szCs w:val="24"/>
+        </w:rPr>
+      </w:pPr>
+      <w:r>
+        <w:rPr>
+          <w:rFonts w:ascii="Arial" w:hAnsi="Arial" w:cs="Arial"/>
+          <w:sz w:val="24"/>
+          <w:szCs w:val="24"/>
+        </w:rPr>
+        <w:t>Resultados</w:t>
+      </w:r>
+    </w:p>
+    <w:p>
+      <w:pPr>
+        <w:pStyle w:val="Prrafodelista"/>
+        <w:numPr>
+          <w:ilvl w:val="1"/>
+          <w:numId w:val="12"/>
+        </w:numPr>
+        <w:jc w:val="both"/>
+        <w:rPr>
+          <w:rFonts w:ascii="Arial" w:hAnsi="Arial" w:cs="Arial"/>
+          <w:b/>
+          <w:sz w:val="24"/>
+          <w:szCs w:val="24"/>
+        </w:rPr>
+      </w:pPr>
+      <w:r>
+        <w:rPr>
+          <w:rFonts w:ascii="Arial" w:hAnsi="Arial" w:cs="Arial"/>
+          <w:sz w:val="24"/>
+          <w:szCs w:val="24"/>
+        </w:rPr>
+        <w:t xml:space="preserve"> Retroalimentación</w:t>
+      </w:r>
+    </w:p>
+    <w:p>
+      <w:pPr>
+        <w:pStyle w:val="Prrafodelista"/>
+        <w:numPr>
+          <w:ilvl w:val="1"/>
+          <w:numId w:val="12"/>
+        </w:numPr>
+        <w:jc w:val="both"/>
+        <w:rPr>
+          <w:rFonts w:ascii="Arial" w:hAnsi="Arial" w:cs="Arial"/>
+          <w:b/>
+          <w:sz w:val="24"/>
+          <w:szCs w:val="24"/>
+        </w:rPr>
+      </w:pPr>
+      <w:r>
+        <w:rPr>
+          <w:rFonts w:ascii="Arial" w:hAnsi="Arial" w:cs="Arial"/>
+          <w:sz w:val="24"/>
+          <w:szCs w:val="24"/>
+        </w:rPr>
+        <w:t xml:space="preserve"> Implementación de la retroalimentación</w:t>
+      </w:r>
+    </w:p>
+    <w:p>
+      <w:pPr>
+        <w:pStyle w:val="Prrafodelista"/>
+        <w:numPr>
+          <w:ilvl w:val="0"/>
+          <w:numId w:val="12"/>
+        </w:numPr>
+        <w:jc w:val="both"/>
+        <w:rPr>
+          <w:rFonts w:ascii="Arial" w:hAnsi="Arial" w:cs="Arial"/>
+          <w:b/>
+          <w:sz w:val="24"/>
+          <w:szCs w:val="24"/>
+        </w:rPr>
+      </w:pPr>
+      <w:r>
+        <w:rPr>
+          <w:rFonts w:ascii="Arial" w:hAnsi="Arial" w:cs="Arial"/>
+          <w:sz w:val="24"/>
+          <w:szCs w:val="24"/>
+        </w:rPr>
+        <w:t>Conclusiones</w:t>
+      </w:r>
+    </w:p>
+    <w:p>
+      <w:pPr>
+        <w:pStyle w:val="Prrafodelista"/>
+        <w:numPr>
+          <w:ilvl w:val="0"/>
+          <w:numId w:val="12"/>
+        </w:numPr>
+        <w:jc w:val="both"/>
+        <w:rPr>
+          <w:rFonts w:ascii="Arial" w:hAnsi="Arial" w:cs="Arial"/>
+          <w:b/>
+          <w:sz w:val="24"/>
+          <w:szCs w:val="24"/>
+        </w:rPr>
+      </w:pPr>
+      <w:r>
+        <w:rPr>
+          <w:rFonts w:ascii="Arial" w:hAnsi="Arial" w:cs="Arial"/>
+          <w:sz w:val="24"/>
+          <w:szCs w:val="24"/>
+        </w:rPr>
+        <w:t>Bibliografía</w:t>
+      </w:r>
+    </w:p>
+    <w:p>
+      <w:pPr>
+        <w:jc w:val="both"/>
+        <w:rPr>
+          <w:rFonts w:ascii="Arial" w:hAnsi="Arial" w:cs="Arial"/>
+          <w:sz w:val="24"/>
+          <w:szCs w:val="24"/>
+        </w:rPr>
+      </w:pPr>
+    </w:p>
+    <w:p>
+      <w:pPr>
+        <w:pStyle w:val="Prrafodelista"/>
         <w:numPr>
           <w:ilvl w:val="0"/>
           <w:numId w:val="7"/>
@@ -1670,29 +3290,1310 @@
         <w:jc w:val="both"/>
         <w:rPr>
           <w:rFonts w:ascii="Arial" w:hAnsi="Arial" w:cs="Arial"/>
-          <w:b/>
-          <w:sz w:val="24"/>
-          <w:szCs w:val="24"/>
-        </w:rPr>
-      </w:pPr>
-    </w:p>
-    <w:p>
-      <w:pPr>
-        <w:jc w:val="both"/>
-        <w:rPr>
-          <w:rFonts w:ascii="Arial" w:hAnsi="Arial" w:cs="Arial"/>
-          <w:b/>
-          <w:sz w:val="24"/>
-          <w:szCs w:val="24"/>
-        </w:rPr>
-      </w:pPr>
-    </w:p>
-    <w:p>
-      <w:pPr>
-        <w:jc w:val="both"/>
-        <w:rPr>
-          <w:rFonts w:ascii="Arial" w:hAnsi="Arial" w:cs="Arial"/>
-          <w:b/>
+          <w:sz w:val="24"/>
+          <w:szCs w:val="24"/>
+        </w:rPr>
+      </w:pPr>
+      <w:proofErr w:type="spellStart"/>
+      <w:r>
+        <w:rPr>
+          <w:rFonts w:ascii="Arial" w:hAnsi="Arial" w:cs="Arial"/>
+          <w:sz w:val="24"/>
+          <w:szCs w:val="24"/>
+        </w:rPr>
+        <w:t>World</w:t>
+      </w:r>
+      <w:proofErr w:type="spellEnd"/>
+      <w:r>
+        <w:rPr>
+          <w:rFonts w:ascii="Arial" w:hAnsi="Arial" w:cs="Arial"/>
+          <w:sz w:val="24"/>
+          <w:szCs w:val="24"/>
+        </w:rPr>
+        <w:t xml:space="preserve"> </w:t>
+      </w:r>
+      <w:proofErr w:type="spellStart"/>
+      <w:r>
+        <w:rPr>
+          <w:rFonts w:ascii="Arial" w:hAnsi="Arial" w:cs="Arial"/>
+          <w:sz w:val="24"/>
+          <w:szCs w:val="24"/>
+        </w:rPr>
+        <w:t>Health</w:t>
+      </w:r>
+      <w:proofErr w:type="spellEnd"/>
+      <w:r>
+        <w:rPr>
+          <w:rFonts w:ascii="Arial" w:hAnsi="Arial" w:cs="Arial"/>
+          <w:sz w:val="24"/>
+          <w:szCs w:val="24"/>
+        </w:rPr>
+        <w:t xml:space="preserve"> </w:t>
+      </w:r>
+      <w:proofErr w:type="spellStart"/>
+      <w:r>
+        <w:rPr>
+          <w:rFonts w:ascii="Arial" w:hAnsi="Arial" w:cs="Arial"/>
+          <w:sz w:val="24"/>
+          <w:szCs w:val="24"/>
+        </w:rPr>
+        <w:t>Organization</w:t>
+      </w:r>
+      <w:proofErr w:type="spellEnd"/>
+      <w:r>
+        <w:rPr>
+          <w:rFonts w:ascii="Arial" w:hAnsi="Arial" w:cs="Arial"/>
+          <w:sz w:val="24"/>
+          <w:szCs w:val="24"/>
+        </w:rPr>
+        <w:t xml:space="preserve">. (s.f.). </w:t>
+      </w:r>
+      <w:proofErr w:type="spellStart"/>
+      <w:r>
+        <w:rPr>
+          <w:rFonts w:ascii="Arial" w:hAnsi="Arial" w:cs="Arial"/>
+          <w:i/>
+          <w:sz w:val="24"/>
+          <w:szCs w:val="24"/>
+        </w:rPr>
+        <w:t>The</w:t>
+      </w:r>
+      <w:proofErr w:type="spellEnd"/>
+      <w:r>
+        <w:rPr>
+          <w:rFonts w:ascii="Arial" w:hAnsi="Arial" w:cs="Arial"/>
+          <w:i/>
+          <w:sz w:val="24"/>
+          <w:szCs w:val="24"/>
+        </w:rPr>
+        <w:t xml:space="preserve"> top 10 causes of </w:t>
+      </w:r>
+      <w:proofErr w:type="spellStart"/>
+      <w:r>
+        <w:rPr>
+          <w:rFonts w:ascii="Arial" w:hAnsi="Arial" w:cs="Arial"/>
+          <w:i/>
+          <w:sz w:val="24"/>
+          <w:szCs w:val="24"/>
+        </w:rPr>
+        <w:t>death</w:t>
+      </w:r>
+      <w:proofErr w:type="spellEnd"/>
+      <w:r>
+        <w:rPr>
+          <w:rFonts w:ascii="Arial" w:hAnsi="Arial" w:cs="Arial"/>
+          <w:i/>
+          <w:sz w:val="24"/>
+          <w:szCs w:val="24"/>
+        </w:rPr>
+        <w:t>.</w:t>
+      </w:r>
+      <w:r>
+        <w:rPr>
+          <w:rFonts w:ascii="Arial" w:hAnsi="Arial" w:cs="Arial"/>
+          <w:sz w:val="24"/>
+          <w:szCs w:val="24"/>
+        </w:rPr>
+        <w:t xml:space="preserve"> </w:t>
+      </w:r>
+      <w:hyperlink r:id="rId5" w:history="1">
+        <w:r>
+          <w:rPr>
+            <w:rStyle w:val="Hipervnculo"/>
+            <w:rFonts w:ascii="Arial" w:hAnsi="Arial" w:cs="Arial"/>
+            <w:sz w:val="24"/>
+            <w:szCs w:val="24"/>
+          </w:rPr>
+          <w:t>https://www.who.int/news-room/fact-sheets/detail/the-top-10-causes-of-death</w:t>
+        </w:r>
+      </w:hyperlink>
+    </w:p>
+    <w:p>
+      <w:pPr>
+        <w:jc w:val="both"/>
+        <w:rPr>
+          <w:rFonts w:ascii="Arial" w:hAnsi="Arial" w:cs="Arial"/>
+          <w:i/>
+          <w:sz w:val="24"/>
+          <w:szCs w:val="24"/>
+        </w:rPr>
+      </w:pPr>
+      <w:proofErr w:type="spellStart"/>
+      <w:r>
+        <w:rPr>
+          <w:rFonts w:ascii="Arial" w:hAnsi="Arial" w:cs="Arial"/>
+          <w:sz w:val="24"/>
+          <w:szCs w:val="24"/>
+        </w:rPr>
+        <w:t>Rehametrics</w:t>
+      </w:r>
+      <w:proofErr w:type="spellEnd"/>
+      <w:r>
+        <w:rPr>
+          <w:rFonts w:ascii="Arial" w:hAnsi="Arial" w:cs="Arial"/>
+          <w:sz w:val="24"/>
+          <w:szCs w:val="24"/>
+        </w:rPr>
+        <w:t xml:space="preserve">. (s.f.). </w:t>
+      </w:r>
+      <w:proofErr w:type="spellStart"/>
+      <w:r>
+        <w:rPr>
+          <w:rFonts w:ascii="Arial" w:hAnsi="Arial" w:cs="Arial"/>
+          <w:i/>
+          <w:sz w:val="24"/>
+          <w:szCs w:val="24"/>
+        </w:rPr>
+        <w:t>Benefits</w:t>
+      </w:r>
+      <w:proofErr w:type="spellEnd"/>
+      <w:r>
+        <w:rPr>
+          <w:rFonts w:ascii="Arial" w:hAnsi="Arial" w:cs="Arial"/>
+          <w:i/>
+          <w:sz w:val="24"/>
+          <w:szCs w:val="24"/>
+        </w:rPr>
+        <w:t xml:space="preserve"> of Hand Tracking in virtual </w:t>
+      </w:r>
+      <w:proofErr w:type="spellStart"/>
+      <w:r>
+        <w:rPr>
+          <w:rFonts w:ascii="Arial" w:hAnsi="Arial" w:cs="Arial"/>
+          <w:i/>
+          <w:sz w:val="24"/>
+          <w:szCs w:val="24"/>
+        </w:rPr>
+        <w:t>rehabilitation</w:t>
+      </w:r>
+      <w:proofErr w:type="spellEnd"/>
+      <w:r>
+        <w:rPr>
+          <w:rFonts w:ascii="Arial" w:hAnsi="Arial" w:cs="Arial"/>
+          <w:i/>
+          <w:sz w:val="24"/>
+          <w:szCs w:val="24"/>
+        </w:rPr>
+        <w:t xml:space="preserve">. </w:t>
+      </w:r>
+      <w:hyperlink r:id="rId6" w:history="1">
+        <w:r>
+          <w:rPr>
+            <w:rStyle w:val="Hipervnculo"/>
+            <w:rFonts w:ascii="Arial" w:hAnsi="Arial" w:cs="Arial"/>
+            <w:i/>
+            <w:sz w:val="24"/>
+            <w:szCs w:val="24"/>
+          </w:rPr>
+          <w:t>https://rehametrics.com/en/benefits-of-hand-tracking-in-virtual-rehabilitation/</w:t>
+        </w:r>
+      </w:hyperlink>
+    </w:p>
+    <w:p>
+      <w:pPr>
+        <w:jc w:val="both"/>
+        <w:rPr>
+          <w:rFonts w:ascii="Arial" w:hAnsi="Arial" w:cs="Arial"/>
+          <w:sz w:val="24"/>
+          <w:szCs w:val="24"/>
+        </w:rPr>
+      </w:pPr>
+      <w:r>
+        <w:rPr>
+          <w:rFonts w:ascii="Arial" w:hAnsi="Arial" w:cs="Arial"/>
+          <w:sz w:val="24"/>
+          <w:szCs w:val="24"/>
+        </w:rPr>
+        <w:t xml:space="preserve">Catania, V., Rundo, F., </w:t>
+      </w:r>
+      <w:proofErr w:type="spellStart"/>
+      <w:r>
+        <w:rPr>
+          <w:rFonts w:ascii="Arial" w:hAnsi="Arial" w:cs="Arial"/>
+          <w:sz w:val="24"/>
+          <w:szCs w:val="24"/>
+        </w:rPr>
+        <w:t>Panerai</w:t>
+      </w:r>
+      <w:proofErr w:type="spellEnd"/>
+      <w:r>
+        <w:rPr>
+          <w:rFonts w:ascii="Arial" w:hAnsi="Arial" w:cs="Arial"/>
+          <w:sz w:val="24"/>
+          <w:szCs w:val="24"/>
+        </w:rPr>
+        <w:t xml:space="preserve">, S., </w:t>
+      </w:r>
+      <w:r>
+        <w:rPr>
+          <w:rFonts w:ascii="Arial" w:hAnsi="Arial" w:cs="Arial"/>
+          <w:sz w:val="24"/>
+          <w:szCs w:val="24"/>
+        </w:rPr>
+        <w:t xml:space="preserve">&amp; Ferri, P. (28 de </w:t>
+      </w:r>
+      <w:proofErr w:type="gramStart"/>
+      <w:r>
+        <w:rPr>
+          <w:rFonts w:ascii="Arial" w:hAnsi="Arial" w:cs="Arial"/>
+          <w:sz w:val="24"/>
+          <w:szCs w:val="24"/>
+        </w:rPr>
+        <w:t>Diciembre</w:t>
+      </w:r>
+      <w:proofErr w:type="gramEnd"/>
+      <w:r>
+        <w:rPr>
+          <w:rFonts w:ascii="Arial" w:hAnsi="Arial" w:cs="Arial"/>
+          <w:sz w:val="24"/>
+          <w:szCs w:val="24"/>
+        </w:rPr>
+        <w:t xml:space="preserve"> de 2023). </w:t>
+      </w:r>
+      <w:r>
+        <w:rPr>
+          <w:rFonts w:ascii="Arial" w:hAnsi="Arial" w:cs="Arial"/>
+          <w:i/>
+          <w:sz w:val="24"/>
+          <w:szCs w:val="24"/>
+        </w:rPr>
+        <w:t xml:space="preserve">Virtual </w:t>
+      </w:r>
+      <w:proofErr w:type="spellStart"/>
+      <w:r>
+        <w:rPr>
+          <w:rFonts w:ascii="Arial" w:hAnsi="Arial" w:cs="Arial"/>
+          <w:i/>
+          <w:sz w:val="24"/>
+          <w:szCs w:val="24"/>
+        </w:rPr>
+        <w:t>Reality</w:t>
+      </w:r>
+      <w:proofErr w:type="spellEnd"/>
+      <w:r>
+        <w:rPr>
+          <w:rFonts w:ascii="Arial" w:hAnsi="Arial" w:cs="Arial"/>
+          <w:i/>
+          <w:sz w:val="24"/>
+          <w:szCs w:val="24"/>
+        </w:rPr>
+        <w:t xml:space="preserve"> </w:t>
+      </w:r>
+      <w:proofErr w:type="spellStart"/>
+      <w:r>
+        <w:rPr>
+          <w:rFonts w:ascii="Arial" w:hAnsi="Arial" w:cs="Arial"/>
+          <w:i/>
+          <w:sz w:val="24"/>
+          <w:szCs w:val="24"/>
+        </w:rPr>
+        <w:t>for</w:t>
+      </w:r>
+      <w:proofErr w:type="spellEnd"/>
+      <w:r>
+        <w:rPr>
+          <w:rFonts w:ascii="Arial" w:hAnsi="Arial" w:cs="Arial"/>
+          <w:i/>
+          <w:sz w:val="24"/>
+          <w:szCs w:val="24"/>
+        </w:rPr>
+        <w:t xml:space="preserve"> </w:t>
+      </w:r>
+      <w:proofErr w:type="spellStart"/>
+      <w:r>
+        <w:rPr>
+          <w:rFonts w:ascii="Arial" w:hAnsi="Arial" w:cs="Arial"/>
+          <w:i/>
+          <w:sz w:val="24"/>
+          <w:szCs w:val="24"/>
+        </w:rPr>
+        <w:t>the</w:t>
+      </w:r>
+      <w:proofErr w:type="spellEnd"/>
+      <w:r>
+        <w:rPr>
+          <w:rFonts w:ascii="Arial" w:hAnsi="Arial" w:cs="Arial"/>
+          <w:i/>
+          <w:sz w:val="24"/>
+          <w:szCs w:val="24"/>
+        </w:rPr>
+        <w:t xml:space="preserve"> </w:t>
+      </w:r>
+      <w:proofErr w:type="spellStart"/>
+      <w:r>
+        <w:rPr>
+          <w:rFonts w:ascii="Arial" w:hAnsi="Arial" w:cs="Arial"/>
+          <w:i/>
+          <w:sz w:val="24"/>
+          <w:szCs w:val="24"/>
+        </w:rPr>
+        <w:t>Rehabilitation</w:t>
+      </w:r>
+      <w:proofErr w:type="spellEnd"/>
+      <w:r>
+        <w:rPr>
+          <w:rFonts w:ascii="Arial" w:hAnsi="Arial" w:cs="Arial"/>
+          <w:i/>
+          <w:sz w:val="24"/>
+          <w:szCs w:val="24"/>
+        </w:rPr>
+        <w:t xml:space="preserve"> of </w:t>
+      </w:r>
+      <w:proofErr w:type="spellStart"/>
+      <w:r>
+        <w:rPr>
+          <w:rFonts w:ascii="Arial" w:hAnsi="Arial" w:cs="Arial"/>
+          <w:i/>
+          <w:sz w:val="24"/>
+          <w:szCs w:val="24"/>
+        </w:rPr>
+        <w:t>Acquired</w:t>
+      </w:r>
+      <w:proofErr w:type="spellEnd"/>
+      <w:r>
+        <w:rPr>
+          <w:rFonts w:ascii="Arial" w:hAnsi="Arial" w:cs="Arial"/>
+          <w:i/>
+          <w:sz w:val="24"/>
+          <w:szCs w:val="24"/>
+        </w:rPr>
+        <w:t xml:space="preserve"> </w:t>
+      </w:r>
+      <w:proofErr w:type="spellStart"/>
+      <w:r>
+        <w:rPr>
+          <w:rFonts w:ascii="Arial" w:hAnsi="Arial" w:cs="Arial"/>
+          <w:i/>
+          <w:sz w:val="24"/>
+          <w:szCs w:val="24"/>
+        </w:rPr>
+        <w:t>Cognitive</w:t>
+      </w:r>
+      <w:proofErr w:type="spellEnd"/>
+      <w:r>
+        <w:rPr>
+          <w:rFonts w:ascii="Arial" w:hAnsi="Arial" w:cs="Arial"/>
+          <w:i/>
+          <w:sz w:val="24"/>
+          <w:szCs w:val="24"/>
+        </w:rPr>
+        <w:t xml:space="preserve"> </w:t>
+      </w:r>
+      <w:proofErr w:type="spellStart"/>
+      <w:r>
+        <w:rPr>
+          <w:rFonts w:ascii="Arial" w:hAnsi="Arial" w:cs="Arial"/>
+          <w:i/>
+          <w:sz w:val="24"/>
+          <w:szCs w:val="24"/>
+        </w:rPr>
+        <w:t>Disroders</w:t>
+      </w:r>
+      <w:proofErr w:type="spellEnd"/>
+      <w:r>
+        <w:rPr>
+          <w:rFonts w:ascii="Arial" w:hAnsi="Arial" w:cs="Arial"/>
+          <w:i/>
+          <w:sz w:val="24"/>
+          <w:szCs w:val="24"/>
+        </w:rPr>
+        <w:t xml:space="preserve">: A </w:t>
+      </w:r>
+      <w:proofErr w:type="spellStart"/>
+      <w:r>
+        <w:rPr>
+          <w:rFonts w:ascii="Arial" w:hAnsi="Arial" w:cs="Arial"/>
+          <w:i/>
+          <w:sz w:val="24"/>
+          <w:szCs w:val="24"/>
+        </w:rPr>
+        <w:t>Narrative</w:t>
+      </w:r>
+      <w:proofErr w:type="spellEnd"/>
+      <w:r>
+        <w:rPr>
+          <w:rFonts w:ascii="Arial" w:hAnsi="Arial" w:cs="Arial"/>
+          <w:i/>
+          <w:sz w:val="24"/>
+          <w:szCs w:val="24"/>
+        </w:rPr>
+        <w:t xml:space="preserve"> </w:t>
+      </w:r>
+      <w:proofErr w:type="spellStart"/>
+      <w:r>
+        <w:rPr>
+          <w:rFonts w:ascii="Arial" w:hAnsi="Arial" w:cs="Arial"/>
+          <w:i/>
+          <w:sz w:val="24"/>
+          <w:szCs w:val="24"/>
+        </w:rPr>
+        <w:t>Review</w:t>
+      </w:r>
+      <w:proofErr w:type="spellEnd"/>
+      <w:r>
+        <w:rPr>
+          <w:rFonts w:ascii="Arial" w:hAnsi="Arial" w:cs="Arial"/>
+          <w:i/>
+          <w:sz w:val="24"/>
+          <w:szCs w:val="24"/>
+        </w:rPr>
+        <w:t xml:space="preserve">. </w:t>
+      </w:r>
+      <w:proofErr w:type="spellStart"/>
+      <w:r>
+        <w:rPr>
+          <w:rFonts w:ascii="Arial" w:hAnsi="Arial" w:cs="Arial"/>
+          <w:sz w:val="24"/>
+          <w:szCs w:val="24"/>
+        </w:rPr>
+        <w:t>Bioengineering</w:t>
+      </w:r>
+      <w:proofErr w:type="spellEnd"/>
+      <w:r>
+        <w:rPr>
+          <w:rFonts w:ascii="Arial" w:hAnsi="Arial" w:cs="Arial"/>
+          <w:sz w:val="24"/>
+          <w:szCs w:val="24"/>
+        </w:rPr>
+        <w:t xml:space="preserve"> 2024, 11(1), 35. </w:t>
+      </w:r>
+      <w:hyperlink r:id="rId7" w:history="1">
+        <w:r>
+          <w:rPr>
+            <w:rStyle w:val="Hipervnculo"/>
+            <w:rFonts w:ascii="Arial" w:hAnsi="Arial" w:cs="Arial"/>
+            <w:sz w:val="24"/>
+            <w:szCs w:val="24"/>
+          </w:rPr>
+          <w:t>https://doi.org/10.3390/bioengineering11010035</w:t>
+        </w:r>
+      </w:hyperlink>
+    </w:p>
+    <w:p>
+      <w:pPr>
+        <w:jc w:val="both"/>
+        <w:rPr>
+          <w:rFonts w:ascii="Arial" w:hAnsi="Arial" w:cs="Arial"/>
+          <w:sz w:val="24"/>
+          <w:szCs w:val="24"/>
+        </w:rPr>
+      </w:pPr>
+      <w:proofErr w:type="spellStart"/>
+      <w:r>
+        <w:rPr>
+          <w:rFonts w:ascii="Arial" w:hAnsi="Arial" w:cs="Arial"/>
+          <w:color w:val="000000" w:themeColor="text1"/>
+          <w:sz w:val="24"/>
+          <w:szCs w:val="24"/>
+        </w:rPr>
+        <w:lastRenderedPageBreak/>
+        <w:t>Grzywacs</w:t>
+      </w:r>
+      <w:proofErr w:type="spellEnd"/>
+      <w:r>
+        <w:rPr>
+          <w:rFonts w:ascii="Arial" w:hAnsi="Arial" w:cs="Arial"/>
+          <w:color w:val="000000" w:themeColor="text1"/>
+          <w:sz w:val="24"/>
+          <w:szCs w:val="24"/>
+        </w:rPr>
+        <w:t xml:space="preserve">, Z., </w:t>
+      </w:r>
+      <w:proofErr w:type="spellStart"/>
+      <w:r>
+        <w:rPr>
+          <w:rFonts w:ascii="Arial" w:hAnsi="Arial" w:cs="Arial"/>
+          <w:color w:val="000000" w:themeColor="text1"/>
+          <w:sz w:val="24"/>
+          <w:szCs w:val="24"/>
+        </w:rPr>
+        <w:t>Jaśniewicz</w:t>
+      </w:r>
+      <w:proofErr w:type="spellEnd"/>
+      <w:r>
+        <w:rPr>
+          <w:rFonts w:ascii="Arial" w:hAnsi="Arial" w:cs="Arial"/>
+          <w:color w:val="000000" w:themeColor="text1"/>
+          <w:sz w:val="24"/>
+          <w:szCs w:val="24"/>
+        </w:rPr>
+        <w:t xml:space="preserve">, J., </w:t>
+      </w:r>
+      <w:proofErr w:type="spellStart"/>
+      <w:r>
+        <w:rPr>
+          <w:rFonts w:ascii="Arial" w:hAnsi="Arial" w:cs="Arial"/>
+          <w:color w:val="000000" w:themeColor="text1"/>
+          <w:sz w:val="24"/>
+          <w:szCs w:val="24"/>
+        </w:rPr>
+        <w:t>Koziarska</w:t>
+      </w:r>
+      <w:proofErr w:type="spellEnd"/>
+      <w:r>
+        <w:rPr>
+          <w:rFonts w:ascii="Arial" w:hAnsi="Arial" w:cs="Arial"/>
+          <w:color w:val="000000" w:themeColor="text1"/>
+          <w:sz w:val="24"/>
+          <w:szCs w:val="24"/>
+        </w:rPr>
+        <w:t xml:space="preserve">, A., </w:t>
+      </w:r>
+      <w:proofErr w:type="spellStart"/>
+      <w:r>
+        <w:rPr>
+          <w:rFonts w:ascii="Arial" w:hAnsi="Arial" w:cs="Arial"/>
+          <w:color w:val="000000" w:themeColor="text1"/>
+          <w:sz w:val="24"/>
+          <w:szCs w:val="24"/>
+        </w:rPr>
+        <w:t>Borzucka</w:t>
+      </w:r>
+      <w:proofErr w:type="spellEnd"/>
+      <w:r>
+        <w:rPr>
+          <w:rFonts w:ascii="Arial" w:hAnsi="Arial" w:cs="Arial"/>
+          <w:color w:val="000000" w:themeColor="text1"/>
+          <w:sz w:val="24"/>
+          <w:szCs w:val="24"/>
+        </w:rPr>
+        <w:t xml:space="preserve">, D. &amp; </w:t>
+      </w:r>
+      <w:proofErr w:type="spellStart"/>
+      <w:r>
+        <w:rPr>
+          <w:rFonts w:ascii="Arial" w:hAnsi="Arial" w:cs="Arial"/>
+          <w:color w:val="000000" w:themeColor="text1"/>
+          <w:sz w:val="24"/>
+          <w:szCs w:val="24"/>
+        </w:rPr>
+        <w:t>Majorczyk</w:t>
+      </w:r>
+      <w:proofErr w:type="spellEnd"/>
+      <w:r>
+        <w:rPr>
+          <w:rFonts w:ascii="Arial" w:hAnsi="Arial" w:cs="Arial"/>
+          <w:color w:val="000000" w:themeColor="text1"/>
+          <w:sz w:val="24"/>
+          <w:szCs w:val="24"/>
+        </w:rPr>
+        <w:t xml:space="preserve">, E. (01 de Julio de 2025). </w:t>
+      </w:r>
+      <w:r>
+        <w:rPr>
+          <w:rFonts w:ascii="Arial" w:hAnsi="Arial" w:cs="Arial"/>
+          <w:i/>
+          <w:color w:val="000000" w:themeColor="text1"/>
+          <w:sz w:val="24"/>
+          <w:szCs w:val="24"/>
+        </w:rPr>
+        <w:t xml:space="preserve">Virtual </w:t>
+      </w:r>
+      <w:proofErr w:type="spellStart"/>
+      <w:r>
+        <w:rPr>
+          <w:rFonts w:ascii="Arial" w:hAnsi="Arial" w:cs="Arial"/>
+          <w:i/>
+          <w:color w:val="000000" w:themeColor="text1"/>
+          <w:sz w:val="24"/>
+          <w:szCs w:val="24"/>
+        </w:rPr>
+        <w:t>Reality</w:t>
+      </w:r>
+      <w:proofErr w:type="spellEnd"/>
+      <w:r>
+        <w:rPr>
+          <w:rFonts w:ascii="Arial" w:hAnsi="Arial" w:cs="Arial"/>
+          <w:i/>
+          <w:color w:val="000000" w:themeColor="text1"/>
+          <w:sz w:val="24"/>
+          <w:szCs w:val="24"/>
+        </w:rPr>
+        <w:t xml:space="preserve"> </w:t>
+      </w:r>
+      <w:proofErr w:type="spellStart"/>
+      <w:r>
+        <w:rPr>
+          <w:rFonts w:ascii="Arial" w:hAnsi="Arial" w:cs="Arial"/>
+          <w:i/>
+          <w:color w:val="000000" w:themeColor="text1"/>
+          <w:sz w:val="24"/>
+          <w:szCs w:val="24"/>
+        </w:rPr>
+        <w:t>Gaming</w:t>
+      </w:r>
+      <w:proofErr w:type="spellEnd"/>
+      <w:r>
+        <w:rPr>
+          <w:rFonts w:ascii="Arial" w:hAnsi="Arial" w:cs="Arial"/>
+          <w:i/>
+          <w:color w:val="000000" w:themeColor="text1"/>
+          <w:sz w:val="24"/>
+          <w:szCs w:val="24"/>
+        </w:rPr>
+        <w:t xml:space="preserve"> and </w:t>
+      </w:r>
+      <w:proofErr w:type="spellStart"/>
+      <w:r>
+        <w:rPr>
+          <w:rFonts w:ascii="Arial" w:hAnsi="Arial" w:cs="Arial"/>
+          <w:i/>
+          <w:color w:val="000000" w:themeColor="text1"/>
+          <w:sz w:val="24"/>
+          <w:szCs w:val="24"/>
+        </w:rPr>
+        <w:t>Its</w:t>
+      </w:r>
+      <w:proofErr w:type="spellEnd"/>
+      <w:r>
+        <w:rPr>
+          <w:rFonts w:ascii="Arial" w:hAnsi="Arial" w:cs="Arial"/>
+          <w:i/>
+          <w:color w:val="000000" w:themeColor="text1"/>
+          <w:sz w:val="24"/>
+          <w:szCs w:val="24"/>
+        </w:rPr>
+        <w:t xml:space="preserve"> </w:t>
+      </w:r>
+      <w:proofErr w:type="spellStart"/>
+      <w:r>
+        <w:rPr>
+          <w:rFonts w:ascii="Arial" w:hAnsi="Arial" w:cs="Arial"/>
+          <w:i/>
+          <w:color w:val="000000" w:themeColor="text1"/>
+          <w:sz w:val="24"/>
+          <w:szCs w:val="24"/>
+        </w:rPr>
+        <w:t>Impact</w:t>
+      </w:r>
+      <w:proofErr w:type="spellEnd"/>
+      <w:r>
+        <w:rPr>
+          <w:rFonts w:ascii="Arial" w:hAnsi="Arial" w:cs="Arial"/>
+          <w:i/>
+          <w:color w:val="000000" w:themeColor="text1"/>
+          <w:sz w:val="24"/>
+          <w:szCs w:val="24"/>
+        </w:rPr>
+        <w:t xml:space="preserve"> and </w:t>
+      </w:r>
+      <w:proofErr w:type="spellStart"/>
+      <w:r>
+        <w:rPr>
+          <w:rFonts w:ascii="Arial" w:hAnsi="Arial" w:cs="Arial"/>
+          <w:i/>
+          <w:color w:val="000000" w:themeColor="text1"/>
+          <w:sz w:val="24"/>
+          <w:szCs w:val="24"/>
+        </w:rPr>
+        <w:t>Effectiveness</w:t>
+      </w:r>
+      <w:proofErr w:type="spellEnd"/>
+      <w:r>
+        <w:rPr>
+          <w:rFonts w:ascii="Arial" w:hAnsi="Arial" w:cs="Arial"/>
+          <w:i/>
+          <w:color w:val="000000" w:themeColor="text1"/>
+          <w:sz w:val="24"/>
+          <w:szCs w:val="24"/>
+        </w:rPr>
+        <w:t xml:space="preserve"> in </w:t>
+      </w:r>
+      <w:proofErr w:type="spellStart"/>
+      <w:r>
+        <w:rPr>
+          <w:rFonts w:ascii="Arial" w:hAnsi="Arial" w:cs="Arial"/>
+          <w:i/>
+          <w:color w:val="000000" w:themeColor="text1"/>
+          <w:sz w:val="24"/>
+          <w:szCs w:val="24"/>
+        </w:rPr>
+        <w:t>Improving</w:t>
+      </w:r>
+      <w:proofErr w:type="spellEnd"/>
+      <w:r>
+        <w:rPr>
+          <w:rFonts w:ascii="Arial" w:hAnsi="Arial" w:cs="Arial"/>
+          <w:i/>
+          <w:color w:val="000000" w:themeColor="text1"/>
+          <w:sz w:val="24"/>
+          <w:szCs w:val="24"/>
+        </w:rPr>
+        <w:t xml:space="preserve"> </w:t>
+      </w:r>
+      <w:proofErr w:type="spellStart"/>
+      <w:r>
+        <w:rPr>
+          <w:rFonts w:ascii="Arial" w:hAnsi="Arial" w:cs="Arial"/>
+          <w:i/>
+          <w:color w:val="000000" w:themeColor="text1"/>
+          <w:sz w:val="24"/>
+          <w:szCs w:val="24"/>
+        </w:rPr>
+        <w:t>Eye</w:t>
+      </w:r>
+      <w:proofErr w:type="spellEnd"/>
+      <w:r>
+        <w:rPr>
+          <w:rFonts w:ascii="Arial" w:hAnsi="Arial" w:cs="Arial"/>
+          <w:i/>
+          <w:color w:val="000000" w:themeColor="text1"/>
+          <w:sz w:val="24"/>
+          <w:szCs w:val="24"/>
+        </w:rPr>
+        <w:t xml:space="preserve">-Hand </w:t>
+      </w:r>
+      <w:proofErr w:type="spellStart"/>
+      <w:r>
+        <w:rPr>
+          <w:rFonts w:ascii="Arial" w:hAnsi="Arial" w:cs="Arial"/>
+          <w:i/>
+          <w:color w:val="000000" w:themeColor="text1"/>
+          <w:sz w:val="24"/>
+          <w:szCs w:val="24"/>
+        </w:rPr>
+        <w:t>Coordintation</w:t>
+      </w:r>
+      <w:proofErr w:type="spellEnd"/>
+      <w:r>
+        <w:rPr>
+          <w:rFonts w:ascii="Arial" w:hAnsi="Arial" w:cs="Arial"/>
+          <w:i/>
+          <w:color w:val="000000" w:themeColor="text1"/>
+          <w:sz w:val="24"/>
+          <w:szCs w:val="24"/>
+        </w:rPr>
+        <w:t xml:space="preserve"> and </w:t>
+      </w:r>
+      <w:proofErr w:type="spellStart"/>
+      <w:r>
+        <w:rPr>
+          <w:rFonts w:ascii="Arial" w:hAnsi="Arial" w:cs="Arial"/>
+          <w:i/>
+          <w:color w:val="000000" w:themeColor="text1"/>
+          <w:sz w:val="24"/>
+          <w:szCs w:val="24"/>
+        </w:rPr>
+        <w:t>Attention</w:t>
+      </w:r>
+      <w:proofErr w:type="spellEnd"/>
+      <w:r>
+        <w:rPr>
+          <w:rFonts w:ascii="Arial" w:hAnsi="Arial" w:cs="Arial"/>
+          <w:i/>
+          <w:color w:val="000000" w:themeColor="text1"/>
+          <w:sz w:val="24"/>
+          <w:szCs w:val="24"/>
+        </w:rPr>
+        <w:t xml:space="preserve"> </w:t>
+      </w:r>
+      <w:proofErr w:type="spellStart"/>
+      <w:r>
+        <w:rPr>
+          <w:rFonts w:ascii="Arial" w:hAnsi="Arial" w:cs="Arial"/>
+          <w:i/>
+          <w:color w:val="000000" w:themeColor="text1"/>
+          <w:sz w:val="24"/>
+          <w:szCs w:val="24"/>
+        </w:rPr>
+        <w:t>Concentration</w:t>
+      </w:r>
+      <w:proofErr w:type="spellEnd"/>
+      <w:r>
+        <w:rPr>
+          <w:rFonts w:ascii="Arial" w:hAnsi="Arial" w:cs="Arial"/>
+          <w:i/>
+          <w:color w:val="000000" w:themeColor="text1"/>
+          <w:sz w:val="24"/>
+          <w:szCs w:val="24"/>
+        </w:rPr>
+        <w:t xml:space="preserve"> in </w:t>
+      </w:r>
+      <w:proofErr w:type="spellStart"/>
+      <w:r>
+        <w:rPr>
+          <w:rFonts w:ascii="Arial" w:hAnsi="Arial" w:cs="Arial"/>
+          <w:i/>
+          <w:color w:val="000000" w:themeColor="text1"/>
+          <w:sz w:val="24"/>
+          <w:szCs w:val="24"/>
+        </w:rPr>
+        <w:t>the</w:t>
+      </w:r>
+      <w:proofErr w:type="spellEnd"/>
+      <w:r>
+        <w:rPr>
+          <w:rFonts w:ascii="Arial" w:hAnsi="Arial" w:cs="Arial"/>
+          <w:i/>
+          <w:color w:val="000000" w:themeColor="text1"/>
+          <w:sz w:val="24"/>
+          <w:szCs w:val="24"/>
+        </w:rPr>
+        <w:t xml:space="preserve"> </w:t>
+      </w:r>
+      <w:proofErr w:type="spellStart"/>
+      <w:r>
+        <w:rPr>
+          <w:rFonts w:ascii="Arial" w:hAnsi="Arial" w:cs="Arial"/>
+          <w:i/>
+          <w:color w:val="000000" w:themeColor="text1"/>
+          <w:sz w:val="24"/>
+          <w:szCs w:val="24"/>
+        </w:rPr>
+        <w:t>Oldest</w:t>
+      </w:r>
+      <w:proofErr w:type="spellEnd"/>
+      <w:r>
+        <w:rPr>
+          <w:rFonts w:ascii="Arial" w:hAnsi="Arial" w:cs="Arial"/>
+          <w:i/>
+          <w:color w:val="000000" w:themeColor="text1"/>
+          <w:sz w:val="24"/>
+          <w:szCs w:val="24"/>
+        </w:rPr>
+        <w:t xml:space="preserve">-Old </w:t>
+      </w:r>
+      <w:proofErr w:type="spellStart"/>
+      <w:r>
+        <w:rPr>
+          <w:rFonts w:ascii="Arial" w:hAnsi="Arial" w:cs="Arial"/>
+          <w:i/>
+          <w:color w:val="000000" w:themeColor="text1"/>
+          <w:sz w:val="24"/>
+          <w:szCs w:val="24"/>
+        </w:rPr>
+        <w:t>Population</w:t>
+      </w:r>
+      <w:proofErr w:type="spellEnd"/>
+      <w:r>
+        <w:rPr>
+          <w:rFonts w:ascii="Arial" w:hAnsi="Arial" w:cs="Arial"/>
+          <w:i/>
+          <w:color w:val="000000" w:themeColor="text1"/>
+          <w:sz w:val="24"/>
+          <w:szCs w:val="24"/>
+        </w:rPr>
+        <w:t xml:space="preserve">. </w:t>
+      </w:r>
+      <w:r>
+        <w:rPr>
+          <w:rFonts w:ascii="Arial" w:hAnsi="Arial" w:cs="Arial"/>
+          <w:color w:val="000000" w:themeColor="text1"/>
+          <w:sz w:val="24"/>
+          <w:szCs w:val="24"/>
+        </w:rPr>
+        <w:t xml:space="preserve">J. </w:t>
+      </w:r>
+      <w:proofErr w:type="spellStart"/>
+      <w:r>
+        <w:rPr>
+          <w:rFonts w:ascii="Arial" w:hAnsi="Arial" w:cs="Arial"/>
+          <w:color w:val="000000" w:themeColor="text1"/>
+          <w:sz w:val="24"/>
+          <w:szCs w:val="24"/>
+        </w:rPr>
+        <w:t>Clin</w:t>
+      </w:r>
+      <w:proofErr w:type="spellEnd"/>
+      <w:r>
+        <w:rPr>
+          <w:rFonts w:ascii="Arial" w:hAnsi="Arial" w:cs="Arial"/>
+          <w:color w:val="000000" w:themeColor="text1"/>
+          <w:sz w:val="24"/>
+          <w:szCs w:val="24"/>
+        </w:rPr>
+        <w:t xml:space="preserve">. </w:t>
+      </w:r>
+      <w:proofErr w:type="spellStart"/>
+      <w:r>
+        <w:rPr>
+          <w:rFonts w:ascii="Arial" w:hAnsi="Arial" w:cs="Arial"/>
+          <w:color w:val="000000" w:themeColor="text1"/>
+          <w:sz w:val="24"/>
+          <w:szCs w:val="24"/>
+        </w:rPr>
+        <w:t>Med</w:t>
+      </w:r>
+      <w:proofErr w:type="spellEnd"/>
+      <w:r>
+        <w:rPr>
+          <w:rFonts w:ascii="Arial" w:hAnsi="Arial" w:cs="Arial"/>
+          <w:color w:val="000000" w:themeColor="text1"/>
+          <w:sz w:val="24"/>
+          <w:szCs w:val="24"/>
+        </w:rPr>
+        <w:t xml:space="preserve">. 2025, 14 (13), 4651. </w:t>
+      </w:r>
+      <w:hyperlink r:id="rId8" w:history="1">
+        <w:r>
+          <w:rPr>
+            <w:rStyle w:val="Hipervnculo"/>
+            <w:rFonts w:ascii="Arial" w:hAnsi="Arial" w:cs="Arial"/>
+            <w:sz w:val="24"/>
+            <w:szCs w:val="24"/>
+          </w:rPr>
+          <w:t>https://doi.org/10.3390/jcm14134651</w:t>
+        </w:r>
+      </w:hyperlink>
+    </w:p>
+    <w:p>
+      <w:pPr>
+        <w:jc w:val="both"/>
+        <w:rPr>
+          <w:rFonts w:ascii="Arial" w:hAnsi="Arial" w:cs="Arial"/>
+          <w:sz w:val="24"/>
+          <w:szCs w:val="24"/>
+        </w:rPr>
+      </w:pPr>
+      <w:r>
+        <w:rPr>
+          <w:rFonts w:ascii="Arial" w:hAnsi="Arial" w:cs="Arial"/>
+          <w:sz w:val="24"/>
+          <w:szCs w:val="24"/>
+        </w:rPr>
+        <w:t xml:space="preserve">Colomer, C., Llorens, R., Noé, E. et al. (11 de </w:t>
+      </w:r>
+      <w:proofErr w:type="gramStart"/>
+      <w:r>
+        <w:rPr>
+          <w:rFonts w:ascii="Arial" w:hAnsi="Arial" w:cs="Arial"/>
+          <w:sz w:val="24"/>
+          <w:szCs w:val="24"/>
+        </w:rPr>
+        <w:t>Mayo</w:t>
+      </w:r>
+      <w:proofErr w:type="gramEnd"/>
+      <w:r>
+        <w:rPr>
+          <w:rFonts w:ascii="Arial" w:hAnsi="Arial" w:cs="Arial"/>
+          <w:sz w:val="24"/>
+          <w:szCs w:val="24"/>
+        </w:rPr>
+        <w:t xml:space="preserve"> de 2026). </w:t>
+      </w:r>
+      <w:proofErr w:type="spellStart"/>
+      <w:r>
+        <w:rPr>
+          <w:rFonts w:ascii="Arial" w:hAnsi="Arial" w:cs="Arial"/>
+          <w:i/>
+          <w:sz w:val="24"/>
+          <w:szCs w:val="24"/>
+        </w:rPr>
+        <w:t>Effect</w:t>
+      </w:r>
+      <w:proofErr w:type="spellEnd"/>
+      <w:r>
+        <w:rPr>
+          <w:rFonts w:ascii="Arial" w:hAnsi="Arial" w:cs="Arial"/>
+          <w:i/>
+          <w:sz w:val="24"/>
+          <w:szCs w:val="24"/>
+        </w:rPr>
+        <w:t xml:space="preserve"> of a </w:t>
+      </w:r>
+      <w:proofErr w:type="spellStart"/>
+      <w:r>
+        <w:rPr>
+          <w:rFonts w:ascii="Arial" w:hAnsi="Arial" w:cs="Arial"/>
+          <w:i/>
+          <w:sz w:val="24"/>
+          <w:szCs w:val="24"/>
+        </w:rPr>
+        <w:t>mixed</w:t>
+      </w:r>
+      <w:proofErr w:type="spellEnd"/>
+      <w:r>
+        <w:rPr>
+          <w:rFonts w:ascii="Arial" w:hAnsi="Arial" w:cs="Arial"/>
+          <w:i/>
+          <w:sz w:val="24"/>
+          <w:szCs w:val="24"/>
+        </w:rPr>
+        <w:t xml:space="preserve"> </w:t>
+      </w:r>
+      <w:proofErr w:type="spellStart"/>
+      <w:r>
+        <w:rPr>
+          <w:rFonts w:ascii="Arial" w:hAnsi="Arial" w:cs="Arial"/>
+          <w:i/>
+          <w:sz w:val="24"/>
+          <w:szCs w:val="24"/>
+        </w:rPr>
+        <w:t>reality-based</w:t>
+      </w:r>
+      <w:proofErr w:type="spellEnd"/>
+      <w:r>
+        <w:rPr>
+          <w:rFonts w:ascii="Arial" w:hAnsi="Arial" w:cs="Arial"/>
+          <w:i/>
+          <w:sz w:val="24"/>
+          <w:szCs w:val="24"/>
+        </w:rPr>
+        <w:t xml:space="preserve"> </w:t>
+      </w:r>
+      <w:proofErr w:type="spellStart"/>
+      <w:r>
+        <w:rPr>
+          <w:rFonts w:ascii="Arial" w:hAnsi="Arial" w:cs="Arial"/>
+          <w:i/>
+          <w:sz w:val="24"/>
+          <w:szCs w:val="24"/>
+        </w:rPr>
+        <w:t>intervention</w:t>
+      </w:r>
+      <w:proofErr w:type="spellEnd"/>
+      <w:r>
+        <w:rPr>
+          <w:rFonts w:ascii="Arial" w:hAnsi="Arial" w:cs="Arial"/>
+          <w:i/>
+          <w:sz w:val="24"/>
+          <w:szCs w:val="24"/>
+        </w:rPr>
+        <w:t xml:space="preserve"> </w:t>
+      </w:r>
+      <w:proofErr w:type="spellStart"/>
+      <w:r>
+        <w:rPr>
+          <w:rFonts w:ascii="Arial" w:hAnsi="Arial" w:cs="Arial"/>
+          <w:i/>
+          <w:sz w:val="24"/>
+          <w:szCs w:val="24"/>
+        </w:rPr>
+        <w:t>on</w:t>
+      </w:r>
+      <w:proofErr w:type="spellEnd"/>
+      <w:r>
+        <w:rPr>
+          <w:rFonts w:ascii="Arial" w:hAnsi="Arial" w:cs="Arial"/>
+          <w:i/>
+          <w:sz w:val="24"/>
+          <w:szCs w:val="24"/>
+        </w:rPr>
+        <w:t xml:space="preserve"> </w:t>
+      </w:r>
+      <w:proofErr w:type="spellStart"/>
+      <w:r>
+        <w:rPr>
+          <w:rFonts w:ascii="Arial" w:hAnsi="Arial" w:cs="Arial"/>
+          <w:i/>
+          <w:sz w:val="24"/>
+          <w:szCs w:val="24"/>
+        </w:rPr>
+        <w:t>arm</w:t>
+      </w:r>
+      <w:proofErr w:type="spellEnd"/>
+      <w:r>
+        <w:rPr>
+          <w:rFonts w:ascii="Arial" w:hAnsi="Arial" w:cs="Arial"/>
+          <w:i/>
+          <w:sz w:val="24"/>
+          <w:szCs w:val="24"/>
+        </w:rPr>
+        <w:t xml:space="preserve">, </w:t>
+      </w:r>
+      <w:proofErr w:type="spellStart"/>
+      <w:r>
+        <w:rPr>
+          <w:rFonts w:ascii="Arial" w:hAnsi="Arial" w:cs="Arial"/>
+          <w:i/>
+          <w:sz w:val="24"/>
+          <w:szCs w:val="24"/>
+        </w:rPr>
+        <w:t>hand</w:t>
+      </w:r>
+      <w:proofErr w:type="spellEnd"/>
+      <w:r>
+        <w:rPr>
+          <w:rFonts w:ascii="Arial" w:hAnsi="Arial" w:cs="Arial"/>
+          <w:i/>
+          <w:sz w:val="24"/>
+          <w:szCs w:val="24"/>
+        </w:rPr>
+        <w:t xml:space="preserve">, and </w:t>
+      </w:r>
+      <w:proofErr w:type="spellStart"/>
+      <w:r>
+        <w:rPr>
+          <w:rFonts w:ascii="Arial" w:hAnsi="Arial" w:cs="Arial"/>
+          <w:i/>
+          <w:sz w:val="24"/>
+          <w:szCs w:val="24"/>
+        </w:rPr>
+        <w:t>finger</w:t>
+      </w:r>
+      <w:proofErr w:type="spellEnd"/>
+      <w:r>
+        <w:rPr>
+          <w:rFonts w:ascii="Arial" w:hAnsi="Arial" w:cs="Arial"/>
+          <w:i/>
+          <w:sz w:val="24"/>
+          <w:szCs w:val="24"/>
+        </w:rPr>
+        <w:t xml:space="preserve"> </w:t>
+      </w:r>
+      <w:proofErr w:type="spellStart"/>
+      <w:r>
+        <w:rPr>
+          <w:rFonts w:ascii="Arial" w:hAnsi="Arial" w:cs="Arial"/>
+          <w:i/>
+          <w:sz w:val="24"/>
+          <w:szCs w:val="24"/>
+        </w:rPr>
+        <w:t>function</w:t>
+      </w:r>
+      <w:proofErr w:type="spellEnd"/>
+      <w:r>
+        <w:rPr>
+          <w:rFonts w:ascii="Arial" w:hAnsi="Arial" w:cs="Arial"/>
+          <w:i/>
+          <w:sz w:val="24"/>
+          <w:szCs w:val="24"/>
+        </w:rPr>
+        <w:t xml:space="preserve"> </w:t>
+      </w:r>
+      <w:proofErr w:type="spellStart"/>
+      <w:r>
+        <w:rPr>
+          <w:rFonts w:ascii="Arial" w:hAnsi="Arial" w:cs="Arial"/>
+          <w:i/>
+          <w:sz w:val="24"/>
+          <w:szCs w:val="24"/>
+        </w:rPr>
+        <w:t>on</w:t>
+      </w:r>
+      <w:proofErr w:type="spellEnd"/>
+      <w:r>
+        <w:rPr>
+          <w:rFonts w:ascii="Arial" w:hAnsi="Arial" w:cs="Arial"/>
+          <w:i/>
+          <w:sz w:val="24"/>
+          <w:szCs w:val="24"/>
+        </w:rPr>
+        <w:t xml:space="preserve"> </w:t>
+      </w:r>
+      <w:proofErr w:type="spellStart"/>
+      <w:r>
+        <w:rPr>
+          <w:rFonts w:ascii="Arial" w:hAnsi="Arial" w:cs="Arial"/>
+          <w:i/>
+          <w:sz w:val="24"/>
+          <w:szCs w:val="24"/>
+        </w:rPr>
+        <w:t>chronic</w:t>
+      </w:r>
+      <w:proofErr w:type="spellEnd"/>
+      <w:r>
+        <w:rPr>
+          <w:rFonts w:ascii="Arial" w:hAnsi="Arial" w:cs="Arial"/>
+          <w:i/>
+          <w:sz w:val="24"/>
+          <w:szCs w:val="24"/>
+        </w:rPr>
+        <w:t xml:space="preserve"> </w:t>
+      </w:r>
+      <w:proofErr w:type="spellStart"/>
+      <w:r>
+        <w:rPr>
+          <w:rFonts w:ascii="Arial" w:hAnsi="Arial" w:cs="Arial"/>
+          <w:i/>
+          <w:sz w:val="24"/>
+          <w:szCs w:val="24"/>
+        </w:rPr>
+        <w:t>stroke</w:t>
+      </w:r>
+      <w:proofErr w:type="spellEnd"/>
+      <w:r>
+        <w:rPr>
+          <w:rFonts w:ascii="Arial" w:hAnsi="Arial" w:cs="Arial"/>
+          <w:i/>
+          <w:sz w:val="24"/>
+          <w:szCs w:val="24"/>
+        </w:rPr>
+        <w:t xml:space="preserve">. </w:t>
+      </w:r>
+      <w:r>
+        <w:rPr>
+          <w:rFonts w:ascii="Arial" w:hAnsi="Arial" w:cs="Arial"/>
+          <w:sz w:val="24"/>
+          <w:szCs w:val="24"/>
+        </w:rPr>
+        <w:t xml:space="preserve">J </w:t>
+      </w:r>
+      <w:proofErr w:type="spellStart"/>
+      <w:r>
+        <w:rPr>
+          <w:rFonts w:ascii="Arial" w:hAnsi="Arial" w:cs="Arial"/>
+          <w:sz w:val="24"/>
+          <w:szCs w:val="24"/>
+        </w:rPr>
+        <w:t>NeouroEngineering</w:t>
+      </w:r>
+      <w:proofErr w:type="spellEnd"/>
+      <w:r>
+        <w:rPr>
+          <w:rFonts w:ascii="Arial" w:hAnsi="Arial" w:cs="Arial"/>
+          <w:sz w:val="24"/>
+          <w:szCs w:val="24"/>
+        </w:rPr>
+        <w:t xml:space="preserve"> </w:t>
+      </w:r>
+      <w:proofErr w:type="spellStart"/>
+      <w:r>
+        <w:rPr>
+          <w:rFonts w:ascii="Arial" w:hAnsi="Arial" w:cs="Arial"/>
+          <w:sz w:val="24"/>
+          <w:szCs w:val="24"/>
+        </w:rPr>
+        <w:t>Rehabil</w:t>
+      </w:r>
+      <w:proofErr w:type="spellEnd"/>
+      <w:r>
+        <w:rPr>
+          <w:rFonts w:ascii="Arial" w:hAnsi="Arial" w:cs="Arial"/>
+          <w:sz w:val="24"/>
+          <w:szCs w:val="24"/>
+        </w:rPr>
+        <w:t xml:space="preserve">, 13, 45 (2016). </w:t>
+      </w:r>
+      <w:hyperlink r:id="rId9" w:history="1">
+        <w:r>
+          <w:rPr>
+            <w:rStyle w:val="Hipervnculo"/>
+            <w:rFonts w:ascii="Arial" w:hAnsi="Arial" w:cs="Arial"/>
+            <w:sz w:val="24"/>
+            <w:szCs w:val="24"/>
+          </w:rPr>
+          <w:t>https://doi.org/10.1186/s12984-016-0153-6</w:t>
+        </w:r>
+      </w:hyperlink>
+    </w:p>
+    <w:p>
+      <w:pPr>
+        <w:jc w:val="both"/>
+        <w:rPr>
+          <w:rFonts w:ascii="Arial" w:hAnsi="Arial" w:cs="Arial"/>
+          <w:sz w:val="24"/>
+          <w:szCs w:val="24"/>
+        </w:rPr>
+      </w:pPr>
+    </w:p>
+    <w:p>
+      <w:pPr>
+        <w:jc w:val="both"/>
+        <w:rPr>
+          <w:rFonts w:ascii="Arial" w:hAnsi="Arial" w:cs="Arial"/>
+          <w:sz w:val="24"/>
+          <w:szCs w:val="24"/>
+        </w:rPr>
+      </w:pPr>
+      <w:bookmarkStart w:id="0" w:name="_GoBack"/>
+      <w:bookmarkEnd w:id="0"/>
+    </w:p>
+    <w:p>
+      <w:pPr>
+        <w:jc w:val="both"/>
+        <w:rPr>
+          <w:rFonts w:ascii="Arial" w:hAnsi="Arial" w:cs="Arial"/>
           <w:sz w:val="24"/>
           <w:szCs w:val="24"/>
         </w:rPr>
@@ -1781,13 +4682,186 @@
         <mc:AlternateContent>
           <mc:Choice Requires="wps">
             <w:drawing>
-              <wp:anchor distT="45720" distB="45720" distL="114300" distR="114300" simplePos="0" relativeHeight="251663360" behindDoc="0" locked="0" layoutInCell="1" allowOverlap="1" wp14:anchorId="00378808" wp14:editId="6D6A4982">
+              <wp:anchor distT="45720" distB="45720" distL="114300" distR="114300" simplePos="0" relativeHeight="251661312" behindDoc="0" locked="0" layoutInCell="1" allowOverlap="1" wp14:anchorId="5F342A72" wp14:editId="6F4D463B">
+                <wp:simplePos x="0" y="0"/>
+                <wp:positionH relativeFrom="column">
+                  <wp:posOffset>0</wp:posOffset>
+                </wp:positionH>
+                <wp:positionV relativeFrom="paragraph">
+                  <wp:posOffset>218440</wp:posOffset>
+                </wp:positionV>
+                <wp:extent cx="2360930" cy="1404620"/>
+                <wp:effectExtent l="0" t="0" r="0" b="0"/>
+                <wp:wrapSquare wrapText="bothSides"/>
+                <wp:docPr id="1" name="Cuadro de texto 2"/>
+                <wp:cNvGraphicFramePr>
+                  <a:graphicFrameLocks xmlns:a="http://schemas.openxmlformats.org/drawingml/2006/main"/>
+                </wp:cNvGraphicFramePr>
+                <a:graphic xmlns:a="http://schemas.openxmlformats.org/drawingml/2006/main">
+                  <a:graphicData uri="http://schemas.microsoft.com/office/word/2010/wordprocessingShape">
+                    <wps:wsp>
+                      <wps:cNvSpPr txBox="1">
+                        <a:spLocks noChangeArrowheads="1"/>
+                      </wps:cNvSpPr>
+                      <wps:spPr bwMode="auto">
+                        <a:xfrm>
+                          <a:off x="0" y="0"/>
+                          <a:ext cx="2360930" cy="1404620"/>
+                        </a:xfrm>
+                        <a:prstGeom prst="rect">
+                          <a:avLst/>
+                        </a:prstGeom>
+                        <a:solidFill>
+                          <a:srgbClr val="FFFFFF"/>
+                        </a:solidFill>
+                        <a:ln w="9525">
+                          <a:noFill/>
+                          <a:miter lim="800000"/>
+                          <a:headEnd/>
+                          <a:tailEnd/>
+                        </a:ln>
+                      </wps:spPr>
+                      <wps:txbx>
+                        <w:txbxContent>
+                          <w:p>
+                            <w:pPr>
+                              <w:jc w:val="center"/>
+                              <w:rPr>
+                                <w:rFonts w:ascii="Arial" w:hAnsi="Arial" w:cs="Arial"/>
+                                <w:b/>
+                              </w:rPr>
+                            </w:pPr>
+                            <w:r>
+                              <w:rPr>
+                                <w:b/>
+                              </w:rPr>
+                              <w:t>___________________________</w:t>
+                            </w:r>
+                            <w:r>
+                              <w:br/>
+                            </w:r>
+                            <w:proofErr w:type="spellStart"/>
+                            <w:r>
+                              <w:rPr>
+                                <w:rFonts w:ascii="Arial" w:hAnsi="Arial" w:cs="Arial"/>
+                                <w:b/>
+                              </w:rPr>
+                              <w:t>Vazquez</w:t>
+                            </w:r>
+                            <w:proofErr w:type="spellEnd"/>
+                            <w:r>
+                              <w:rPr>
+                                <w:rFonts w:ascii="Arial" w:hAnsi="Arial" w:cs="Arial"/>
+                                <w:b/>
+                              </w:rPr>
+                              <w:t xml:space="preserve"> Torrijos </w:t>
+                            </w:r>
+                            <w:proofErr w:type="spellStart"/>
+                            <w:r>
+                              <w:rPr>
+                                <w:rFonts w:ascii="Arial" w:hAnsi="Arial" w:cs="Arial"/>
+                                <w:b/>
+                              </w:rPr>
+                              <w:t>Damian</w:t>
+                            </w:r>
+                            <w:proofErr w:type="spellEnd"/>
+                          </w:p>
+                        </w:txbxContent>
+                      </wps:txbx>
+                      <wps:bodyPr rot="0" vert="horz" wrap="square" lIns="91440" tIns="45720" rIns="91440" bIns="45720" anchor="t" anchorCtr="0">
+                        <a:spAutoFit/>
+                      </wps:bodyPr>
+                    </wps:wsp>
+                  </a:graphicData>
+                </a:graphic>
+                <wp14:sizeRelH relativeFrom="margin">
+                  <wp14:pctWidth>40000</wp14:pctWidth>
+                </wp14:sizeRelH>
+                <wp14:sizeRelV relativeFrom="margin">
+                  <wp14:pctHeight>20000</wp14:pctHeight>
+                </wp14:sizeRelV>
+              </wp:anchor>
+            </w:drawing>
+          </mc:Choice>
+          <mc:Fallback>
+            <w:pict>
+              <v:shapetype w14:anchorId="5F342A72" id="_x0000_t202" coordsize="21600,21600" o:spt="202" path="m,l,21600r21600,l21600,xe">
+                <v:stroke joinstyle="miter"/>
+                <v:path gradientshapeok="t" o:connecttype="rect"/>
+              </v:shapetype>
+              <v:shape id="Cuadro de texto 2" o:spid="_x0000_s1026" type="#_x0000_t202" style="position:absolute;left:0;text-align:left;margin-left:0;margin-top:17.2pt;width:185.9pt;height:110.6pt;z-index:251661312;visibility:visible;mso-wrap-style:square;mso-width-percent:400;mso-height-percent:200;mso-wrap-distance-left:9pt;mso-wrap-distance-top:3.6pt;mso-wrap-distance-right:9pt;mso-wrap-distance-bottom:3.6pt;mso-position-horizontal:absolute;mso-position-horizontal-relative:text;mso-position-vertical:absolute;mso-position-vertical-relative:text;mso-width-percent:400;mso-height-percent:200;mso-width-relative:margin;mso-height-relative:margin;v-text-anchor:top" o:gfxdata="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" stroked="f">
+                <v:textbox style="mso-fit-shape-to-text:t">
+                  <w:txbxContent>
+                    <w:p>
+                      <w:pPr>
+                        <w:jc w:val="center"/>
+                        <w:rPr>
+                          <w:rFonts w:ascii="Arial" w:hAnsi="Arial" w:cs="Arial"/>
+                          <w:b/>
+                        </w:rPr>
+                      </w:pPr>
+                      <w:r>
+                        <w:rPr>
+                          <w:b/>
+                        </w:rPr>
+                        <w:t>___________________________</w:t>
+                      </w:r>
+                      <w:r>
+                        <w:br/>
+                      </w:r>
+                      <w:proofErr w:type="spellStart"/>
+                      <w:r>
+                        <w:rPr>
+                          <w:rFonts w:ascii="Arial" w:hAnsi="Arial" w:cs="Arial"/>
+                          <w:b/>
+                        </w:rPr>
+                        <w:t>Vazquez</w:t>
+                      </w:r>
+                      <w:proofErr w:type="spellEnd"/>
+                      <w:r>
+                        <w:rPr>
+                          <w:rFonts w:ascii="Arial" w:hAnsi="Arial" w:cs="Arial"/>
+                          <w:b/>
+                        </w:rPr>
+                        <w:t xml:space="preserve"> Torrijos </w:t>
+                      </w:r>
+                      <w:proofErr w:type="spellStart"/>
+                      <w:r>
+                        <w:rPr>
+                          <w:rFonts w:ascii="Arial" w:hAnsi="Arial" w:cs="Arial"/>
+                          <w:b/>
+                        </w:rPr>
+                        <w:t>Damian</w:t>
+                      </w:r>
+                      <w:proofErr w:type="spellEnd"/>
+                    </w:p>
+                  </w:txbxContent>
+                </v:textbox>
+                <w10:wrap type="square"/>
+              </v:shape>
+            </w:pict>
+          </mc:Fallback>
+        </mc:AlternateContent>
+      </w:r>
+      <w:r>
+        <w:rPr>
+          <w:rFonts w:ascii="Arial" w:hAnsi="Arial" w:cs="Arial"/>
+          <w:b/>
+          <w:noProof/>
+          <w:sz w:val="24"/>
+          <w:szCs w:val="24"/>
+          <w:lang w:eastAsia="es-ES"/>
+        </w:rPr>
+        <mc:AlternateContent>
+          <mc:Choice Requires="wps">
+            <w:drawing>
+              <wp:anchor distT="45720" distB="45720" distL="114300" distR="114300" simplePos="0" relativeHeight="251663360" behindDoc="0" locked="0" layoutInCell="1" allowOverlap="1" wp14:anchorId="7C0FB5B8" wp14:editId="01BB5E04">
                 <wp:simplePos x="0" y="0"/>
                 <wp:positionH relativeFrom="margin">
-                  <wp:posOffset>2647950</wp:posOffset>
+                  <wp:posOffset>3203575</wp:posOffset>
                 </wp:positionH>
                 <wp:positionV relativeFrom="paragraph">
-                  <wp:posOffset>338455</wp:posOffset>
+                  <wp:posOffset>221541</wp:posOffset>
                 </wp:positionV>
                 <wp:extent cx="2985135" cy="1404620"/>
                 <wp:effectExtent l="0" t="0" r="5715" b="8255"/>
@@ -1915,11 +4989,7 @@
           </mc:Choice>
           <mc:Fallback>
             <w:pict>
-              <v:shapetype w14:anchorId="00378808" id="_x0000_t202" coordsize="21600,21600" o:spt="202" path="m,l,21600r21600,l21600,xe">
-                <v:stroke joinstyle="miter"/>
-                <v:path gradientshapeok="t" o:connecttype="rect"/>
-              </v:shapetype>
-              <v:shape id="Cuadro de texto 2" o:spid="_x0000_s1026" type="#_x0000_t202" style="position:absolute;left:0;text-align:left;margin-left:208.5pt;margin-top:26.65pt;width:235.05pt;height:110.6pt;z-index:251663360;visibility:visible;mso-wrap-style:square;mso-width-percent:0;mso-height-percent:200;mso-wrap-distance-left:9pt;mso-wrap-distance-top:3.6pt;mso-wrap-distance-right:9pt;mso-wrap-distance-bottom:3.6pt;mso-position-horizontal:absolute;mso-position-horizontal-relative:margin;mso-position-vertical:absolute;mso-position-vertical-relative:text;mso-width-percent:0;mso-height-percent:200;mso-width-relative:margin;mso-height-relative:margin;v-text-anchor:top" o:gfxdata="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" stroked="f">
+              <v:shape w14:anchorId="7C0FB5B8" id="_x0000_s1027" type="#_x0000_t202" style="position:absolute;left:0;text-align:left;margin-left:252.25pt;margin-top:17.45pt;width:235.05pt;height:110.6pt;z-index:251663360;visibility:visible;mso-wrap-style:square;mso-width-percent:0;mso-height-percent:200;mso-wrap-distance-left:9pt;mso-wrap-distance-top:3.6pt;mso-wrap-distance-right:9pt;mso-wrap-distance-bottom:3.6pt;mso-position-horizontal:absolute;mso-position-horizontal-relative:margin;mso-position-vertical:absolute;mso-position-vertical-relative:text;mso-width-percent:0;mso-height-percent:200;mso-width-relative:margin;mso-height-relative:margin;v-text-anchor:top" o:gfxdata="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" stroked="f">
                 <v:textbox style="mso-fit-shape-to-text:t">
                   <w:txbxContent>
                     <w:p>
@@ -2004,175 +5074,6 @@
           </mc:Fallback>
         </mc:AlternateContent>
       </w:r>
-      <w:r>
-        <w:rPr>
-          <w:rFonts w:ascii="Arial" w:hAnsi="Arial" w:cs="Arial"/>
-          <w:b/>
-          <w:noProof/>
-          <w:sz w:val="24"/>
-          <w:szCs w:val="24"/>
-          <w:lang w:eastAsia="es-ES"/>
-        </w:rPr>
-        <mc:AlternateContent>
-          <mc:Choice Requires="wps">
-            <w:drawing>
-              <wp:anchor distT="45720" distB="45720" distL="114300" distR="114300" simplePos="0" relativeHeight="251661312" behindDoc="0" locked="0" layoutInCell="1" allowOverlap="1" wp14:anchorId="00378808" wp14:editId="6D6A4982">
-                <wp:simplePos x="0" y="0"/>
-                <wp:positionH relativeFrom="column">
-                  <wp:posOffset>0</wp:posOffset>
-                </wp:positionH>
-                <wp:positionV relativeFrom="paragraph">
-                  <wp:posOffset>340995</wp:posOffset>
-                </wp:positionV>
-                <wp:extent cx="2360930" cy="1404620"/>
-                <wp:effectExtent l="0" t="0" r="0" b="0"/>
-                <wp:wrapSquare wrapText="bothSides"/>
-                <wp:docPr id="1" name="Cuadro de texto 2"/>
-                <wp:cNvGraphicFramePr>
-                  <a:graphicFrameLocks xmlns:a="http://schemas.openxmlformats.org/drawingml/2006/main"/>
-                </wp:cNvGraphicFramePr>
-                <a:graphic xmlns:a="http://schemas.openxmlformats.org/drawingml/2006/main">
-                  <a:graphicData uri="http://schemas.microsoft.com/office/word/2010/wordprocessingShape">
-                    <wps:wsp>
-                      <wps:cNvSpPr txBox="1">
-                        <a:spLocks noChangeArrowheads="1"/>
-                      </wps:cNvSpPr>
-                      <wps:spPr bwMode="auto">
-                        <a:xfrm>
-                          <a:off x="0" y="0"/>
-                          <a:ext cx="2360930" cy="1404620"/>
-                        </a:xfrm>
-                        <a:prstGeom prst="rect">
-                          <a:avLst/>
-                        </a:prstGeom>
-                        <a:solidFill>
-                          <a:srgbClr val="FFFFFF"/>
-                        </a:solidFill>
-                        <a:ln w="9525">
-                          <a:noFill/>
-                          <a:miter lim="800000"/>
-                          <a:headEnd/>
-                          <a:tailEnd/>
-                        </a:ln>
-                      </wps:spPr>
-                      <wps:txbx>
-                        <w:txbxContent>
-                          <w:p>
-                            <w:pPr>
-                              <w:jc w:val="center"/>
-                              <w:rPr>
-                                <w:rFonts w:ascii="Arial" w:hAnsi="Arial" w:cs="Arial"/>
-                                <w:b/>
-                              </w:rPr>
-                            </w:pPr>
-                            <w:r>
-                              <w:rPr>
-                                <w:b/>
-                              </w:rPr>
-                              <w:t>___________________________</w:t>
-                            </w:r>
-                            <w:r>
-                              <w:br/>
-                            </w:r>
-                            <w:proofErr w:type="spellStart"/>
-                            <w:r>
-                              <w:rPr>
-                                <w:rFonts w:ascii="Arial" w:hAnsi="Arial" w:cs="Arial"/>
-                                <w:b/>
-                              </w:rPr>
-                              <w:t>Vazquez</w:t>
-                            </w:r>
-                            <w:proofErr w:type="spellEnd"/>
-                            <w:r>
-                              <w:rPr>
-                                <w:rFonts w:ascii="Arial" w:hAnsi="Arial" w:cs="Arial"/>
-                                <w:b/>
-                              </w:rPr>
-                              <w:t xml:space="preserve"> Torrijos </w:t>
-                            </w:r>
-                            <w:proofErr w:type="spellStart"/>
-                            <w:r>
-                              <w:rPr>
-                                <w:rFonts w:ascii="Arial" w:hAnsi="Arial" w:cs="Arial"/>
-                                <w:b/>
-                              </w:rPr>
-                              <w:t>Damian</w:t>
-                            </w:r>
-                            <w:proofErr w:type="spellEnd"/>
-                          </w:p>
-                        </w:txbxContent>
-                      </wps:txbx>
-                      <wps:bodyPr rot="0" vert="horz" wrap="square" lIns="91440" tIns="45720" rIns="91440" bIns="45720" anchor="t" anchorCtr="0">
-                        <a:spAutoFit/>
-                      </wps:bodyPr>
-                    </wps:wsp>
-                  </a:graphicData>
-                </a:graphic>
-                <wp14:sizeRelH relativeFrom="margin">
-                  <wp14:pctWidth>40000</wp14:pctWidth>
-                </wp14:sizeRelH>
-                <wp14:sizeRelV relativeFrom="margin">
-                  <wp14:pctHeight>20000</wp14:pctHeight>
-                </wp14:sizeRelV>
-              </wp:anchor>
-            </w:drawing>
-          </mc:Choice>
-          <mc:Fallback>
-            <w:pict>
-              <v:shape w14:anchorId="00378808" id="_x0000_s1027" type="#_x0000_t202" style="position:absolute;left:0;text-align:left;margin-left:0;margin-top:26.85pt;width:185.9pt;height:110.6pt;z-index:251661312;visibility:visible;mso-wrap-style:square;mso-width-percent:400;mso-height-percent:200;mso-wrap-distance-left:9pt;mso-wrap-distance-top:3.6pt;mso-wrap-distance-right:9pt;mso-wrap-distance-bottom:3.6pt;mso-position-horizontal:absolute;mso-position-horizontal-relative:text;mso-position-vertical:absolute;mso-position-vertical-relative:text;mso-width-percent:400;mso-height-percent:200;mso-width-relative:margin;mso-height-relative:margin;v-text-anchor:top" o:gfxdata="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" stroked="f">
-                <v:textbox style="mso-fit-shape-to-text:t">
-                  <w:txbxContent>
-                    <w:p>
-                      <w:pPr>
-                        <w:jc w:val="center"/>
-                        <w:rPr>
-                          <w:rFonts w:ascii="Arial" w:hAnsi="Arial" w:cs="Arial"/>
-                          <w:b/>
-                        </w:rPr>
-                      </w:pPr>
-                      <w:r>
-                        <w:rPr>
-                          <w:b/>
-                        </w:rPr>
-                        <w:t>___________________________</w:t>
-                      </w:r>
-                      <w:r>
-                        <w:br/>
-                      </w:r>
-                      <w:proofErr w:type="spellStart"/>
-                      <w:r>
-                        <w:rPr>
-                          <w:rFonts w:ascii="Arial" w:hAnsi="Arial" w:cs="Arial"/>
-                          <w:b/>
-                        </w:rPr>
-                        <w:t>Vazquez</w:t>
-                      </w:r>
-                      <w:proofErr w:type="spellEnd"/>
-                      <w:r>
-                        <w:rPr>
-                          <w:rFonts w:ascii="Arial" w:hAnsi="Arial" w:cs="Arial"/>
-                          <w:b/>
-                        </w:rPr>
-                        <w:t xml:space="preserve"> Torrijos </w:t>
-                      </w:r>
-                      <w:proofErr w:type="spellStart"/>
-                      <w:r>
-                        <w:rPr>
-                          <w:rFonts w:ascii="Arial" w:hAnsi="Arial" w:cs="Arial"/>
-                          <w:b/>
-                        </w:rPr>
-                        <w:t>Damian</w:t>
-                      </w:r>
-                      <w:proofErr w:type="spellEnd"/>
-                    </w:p>
-                  </w:txbxContent>
-                </v:textbox>
-                <w10:wrap type="square"/>
-              </v:shape>
-            </w:pict>
-          </mc:Fallback>
-        </mc:AlternateContent>
-      </w:r>
     </w:p>
     <w:sectPr>
       <w:pgSz w:w="11906" w:h="16838"/>
@@ -2187,6 +5088,178 @@
 <file path=word/numbering.xml><?xml version="1.0" encoding="utf-8"?>
 <w:numbering xmlns:wpc="http://schemas.microsoft.com/office/word/2010/wordprocessingCanvas" xmlns:cx="http://schemas.microsoft.com/office/drawing/2014/chartex" xmlns:mc="http://schemas.openxmlformats.org/markup-compatibility/2006" xmlns:o="urn:schemas-microsoft-com:office:office" xmlns:r="http://schemas.openxmlformats.org/officeDocument/2006/relationships" xmlns:m="http://schemas.openxmlformats.org/officeDocument/2006/math" xmlns:v="urn:schemas-microsoft-com:vml" xmlns:wp14="http://schemas.microsoft.com/office/word/2010/wordprocessingDrawing" xmlns:wp="http://schemas.openxmlformats.org/drawingml/2006/wordprocessingDrawing" xmlns:w10="urn:schemas-microsoft-com:office:word" xmlns:w="http://schemas.openxmlformats.org/wordprocessingml/2006/main" xmlns:w14="http://schemas.microsoft.com/office/word/2010/wordml" xmlns:w15="http://schemas.microsoft.com/office/word/2012/wordml" xmlns:w16se="http://schemas.microsoft.com/office/word/2015/wordml/symex" xmlns:wpg="http://schemas.microsoft.com/office/word/2010/wordprocessingGroup" xmlns:wpi="http://schemas.microsoft.com/office/word/2010/wordprocessingInk" xmlns:wne="http://schemas.microsoft.com/office/word/2006/wordml" xmlns:wps="http://schemas.microsoft.com/office/word/2010/wordprocessingShape" mc:Ignorable="w14 w15 w16se wp14">
   <w:abstractNum w:abstractNumId="0" w15:restartNumberingAfterBreak="0">
+    <w:nsid w:val="1490143D"/>
+    <w:multiLevelType w:val="multilevel"/>
+    <w:tmpl w:val="0C0A001F"/>
+    <w:lvl w:ilvl="0">
+      <w:start w:val="1"/>
+      <w:numFmt w:val="decimal"/>
+      <w:lvlText w:val="%1."/>
+      <w:lvlJc w:val="left"/>
+      <w:pPr>
+        <w:ind w:left="720" w:hanging="360"/>
+      </w:pPr>
+    </w:lvl>
+    <w:lvl w:ilvl="1">
+      <w:start w:val="1"/>
+      <w:numFmt w:val="decimal"/>
+      <w:lvlText w:val="%1.%2."/>
+      <w:lvlJc w:val="left"/>
+      <w:pPr>
+        <w:ind w:left="1152" w:hanging="432"/>
+      </w:pPr>
+    </w:lvl>
+    <w:lvl w:ilvl="2">
+      <w:start w:val="1"/>
+      <w:numFmt w:val="decimal"/>
+      <w:lvlText w:val="%1.%2.%3."/>
+      <w:lvlJc w:val="left"/>
+      <w:pPr>
+        <w:ind w:left="1584" w:hanging="504"/>
+      </w:pPr>
+    </w:lvl>
+    <w:lvl w:ilvl="3">
+      <w:start w:val="1"/>
+      <w:numFmt w:val="decimal"/>
+      <w:lvlText w:val="%1.%2.%3.%4."/>
+      <w:lvlJc w:val="left"/>
+      <w:pPr>
+        <w:ind w:left="2088" w:hanging="648"/>
+      </w:pPr>
+    </w:lvl>
+    <w:lvl w:ilvl="4">
+      <w:start w:val="1"/>
+      <w:numFmt w:val="decimal"/>
+      <w:lvlText w:val="%1.%2.%3.%4.%5."/>
+      <w:lvlJc w:val="left"/>
+      <w:pPr>
+        <w:ind w:left="2592" w:hanging="792"/>
+      </w:pPr>
+    </w:lvl>
+    <w:lvl w:ilvl="5">
+      <w:start w:val="1"/>
+      <w:numFmt w:val="decimal"/>
+      <w:lvlText w:val="%1.%2.%3.%4.%5.%6."/>
+      <w:lvlJc w:val="left"/>
+      <w:pPr>
+        <w:ind w:left="3096" w:hanging="936"/>
+      </w:pPr>
+    </w:lvl>
+    <w:lvl w:ilvl="6">
+      <w:start w:val="1"/>
+      <w:numFmt w:val="decimal"/>
+      <w:lvlText w:val="%1.%2.%3.%4.%5.%6.%7."/>
+      <w:lvlJc w:val="left"/>
+      <w:pPr>
+        <w:ind w:left="3600" w:hanging="1080"/>
+      </w:pPr>
+    </w:lvl>
+    <w:lvl w:ilvl="7">
+      <w:start w:val="1"/>
+      <w:numFmt w:val="decimal"/>
+      <w:lvlText w:val="%1.%2.%3.%4.%5.%6.%7.%8."/>
+      <w:lvlJc w:val="left"/>
+      <w:pPr>
+        <w:ind w:left="4104" w:hanging="1224"/>
+      </w:pPr>
+    </w:lvl>
+    <w:lvl w:ilvl="8">
+      <w:start w:val="1"/>
+      <w:numFmt w:val="decimal"/>
+      <w:lvlText w:val="%1.%2.%3.%4.%5.%6.%7.%8.%9."/>
+      <w:lvlJc w:val="left"/>
+      <w:pPr>
+        <w:ind w:left="4680" w:hanging="1440"/>
+      </w:pPr>
+    </w:lvl>
+  </w:abstractNum>
+  <w:abstractNum w:abstractNumId="1" w15:restartNumberingAfterBreak="0">
+    <w:nsid w:val="18D712CB"/>
+    <w:multiLevelType w:val="multilevel"/>
+    <w:tmpl w:val="0C0A001F"/>
+    <w:lvl w:ilvl="0">
+      <w:start w:val="1"/>
+      <w:numFmt w:val="decimal"/>
+      <w:lvlText w:val="%1."/>
+      <w:lvlJc w:val="left"/>
+      <w:pPr>
+        <w:ind w:left="360" w:hanging="360"/>
+      </w:pPr>
+    </w:lvl>
+    <w:lvl w:ilvl="1">
+      <w:start w:val="1"/>
+      <w:numFmt w:val="decimal"/>
+      <w:lvlText w:val="%1.%2."/>
+      <w:lvlJc w:val="left"/>
+      <w:pPr>
+        <w:ind w:left="792" w:hanging="432"/>
+      </w:pPr>
+    </w:lvl>
+    <w:lvl w:ilvl="2">
+      <w:start w:val="1"/>
+      <w:numFmt w:val="decimal"/>
+      <w:lvlText w:val="%1.%2.%3."/>
+      <w:lvlJc w:val="left"/>
+      <w:pPr>
+        <w:ind w:left="1224" w:hanging="504"/>
+      </w:pPr>
+    </w:lvl>
+    <w:lvl w:ilvl="3">
+      <w:start w:val="1"/>
+      <w:numFmt w:val="decimal"/>
+      <w:lvlText w:val="%1.%2.%3.%4."/>
+      <w:lvlJc w:val="left"/>
+      <w:pPr>
+        <w:ind w:left="1728" w:hanging="648"/>
+      </w:pPr>
+    </w:lvl>
+    <w:lvl w:ilvl="4">
+      <w:start w:val="1"/>
+      <w:numFmt w:val="decimal"/>
+      <w:lvlText w:val="%1.%2.%3.%4.%5."/>
+      <w:lvlJc w:val="left"/>
+      <w:pPr>
+        <w:ind w:left="2232" w:hanging="792"/>
+      </w:pPr>
+    </w:lvl>
+    <w:lvl w:ilvl="5">
+      <w:start w:val="1"/>
+      <w:numFmt w:val="decimal"/>
+      <w:lvlText w:val="%1.%2.%3.%4.%5.%6."/>
+      <w:lvlJc w:val="left"/>
+      <w:pPr>
+        <w:ind w:left="2736" w:hanging="936"/>
+      </w:pPr>
+    </w:lvl>
+    <w:lvl w:ilvl="6">
+      <w:start w:val="1"/>
+      <w:numFmt w:val="decimal"/>
+      <w:lvlText w:val="%1.%2.%3.%4.%5.%6.%7."/>
+      <w:lvlJc w:val="left"/>
+      <w:pPr>
+        <w:ind w:left="3240" w:hanging="1080"/>
+      </w:pPr>
+    </w:lvl>
+    <w:lvl w:ilvl="7">
+      <w:start w:val="1"/>
+      <w:numFmt w:val="decimal"/>
+      <w:lvlText w:val="%1.%2.%3.%4.%5.%6.%7.%8."/>
+      <w:lvlJc w:val="left"/>
+      <w:pPr>
+        <w:ind w:left="3744" w:hanging="1224"/>
+      </w:pPr>
+    </w:lvl>
+    <w:lvl w:ilvl="8">
+      <w:start w:val="1"/>
+      <w:numFmt w:val="decimal"/>
+      <w:lvlText w:val="%1.%2.%3.%4.%5.%6.%7.%8.%9."/>
+      <w:lvlJc w:val="left"/>
+      <w:pPr>
+        <w:ind w:left="4320" w:hanging="1440"/>
+      </w:pPr>
+    </w:lvl>
+  </w:abstractNum>
+  <w:abstractNum w:abstractNumId="2" w15:restartNumberingAfterBreak="0">
     <w:nsid w:val="1BBF19B6"/>
     <w:multiLevelType w:val="hybridMultilevel"/>
     <w:tmpl w:val="22C0AADE"/>
@@ -2275,7 +5348,7 @@
       </w:pPr>
     </w:lvl>
   </w:abstractNum>
-  <w:abstractNum w:abstractNumId="1" w15:restartNumberingAfterBreak="0">
+  <w:abstractNum w:abstractNumId="3" w15:restartNumberingAfterBreak="0">
     <w:nsid w:val="1D9048C9"/>
     <w:multiLevelType w:val="hybridMultilevel"/>
     <w:tmpl w:val="BE381F52"/>
@@ -2364,7 +5437,7 @@
       </w:pPr>
     </w:lvl>
   </w:abstractNum>
-  <w:abstractNum w:abstractNumId="2" w15:restartNumberingAfterBreak="0">
+  <w:abstractNum w:abstractNumId="4" w15:restartNumberingAfterBreak="0">
     <w:nsid w:val="2BD41DE6"/>
     <w:multiLevelType w:val="hybridMultilevel"/>
     <w:tmpl w:val="818C5A9A"/>
@@ -2453,7 +5526,7 @@
       </w:pPr>
     </w:lvl>
   </w:abstractNum>
-  <w:abstractNum w:abstractNumId="3" w15:restartNumberingAfterBreak="0">
+  <w:abstractNum w:abstractNumId="5" w15:restartNumberingAfterBreak="0">
     <w:nsid w:val="3299434A"/>
     <w:multiLevelType w:val="hybridMultilevel"/>
     <w:tmpl w:val="1BB8CB84"/>
@@ -2542,7 +5615,206 @@
       </w:pPr>
     </w:lvl>
   </w:abstractNum>
-  <w:abstractNum w:abstractNumId="4" w15:restartNumberingAfterBreak="0">
+  <w:abstractNum w:abstractNumId="6" w15:restartNumberingAfterBreak="0">
+    <w:nsid w:val="3486327C"/>
+    <w:multiLevelType w:val="hybridMultilevel"/>
+    <w:tmpl w:val="EDEC2D92"/>
+    <w:lvl w:ilvl="0" w:tplc="0C0A0001">
+      <w:start w:val="1"/>
+      <w:numFmt w:val="bullet"/>
+      <w:lvlText w:val=""/>
+      <w:lvlJc w:val="left"/>
+      <w:pPr>
+        <w:ind w:left="1512" w:hanging="360"/>
+      </w:pPr>
+      <w:rPr>
+        <w:rFonts w:ascii="Symbol" w:hAnsi="Symbol" w:hint="default"/>
+      </w:rPr>
+    </w:lvl>
+    <w:lvl w:ilvl="1" w:tplc="0C0A0003" w:tentative="1">
+      <w:start w:val="1"/>
+      <w:numFmt w:val="bullet"/>
+      <w:lvlText w:val="o"/>
+      <w:lvlJc w:val="left"/>
+      <w:pPr>
+        <w:ind w:left="2232" w:hanging="360"/>
+      </w:pPr>
+      <w:rPr>
+        <w:rFonts w:ascii="Courier New" w:hAnsi="Courier New" w:cs="Courier New" w:hint="default"/>
+      </w:rPr>
+    </w:lvl>
+    <w:lvl w:ilvl="2" w:tplc="0C0A0005" w:tentative="1">
+      <w:start w:val="1"/>
+      <w:numFmt w:val="bullet"/>
+      <w:lvlText w:val=""/>
+      <w:lvlJc w:val="left"/>
+      <w:pPr>
+        <w:ind w:left="2952" w:hanging="360"/>
+      </w:pPr>
+      <w:rPr>
+        <w:rFonts w:ascii="Wingdings" w:hAnsi="Wingdings" w:hint="default"/>
+      </w:rPr>
+    </w:lvl>
+    <w:lvl w:ilvl="3" w:tplc="0C0A0001" w:tentative="1">
+      <w:start w:val="1"/>
+      <w:numFmt w:val="bullet"/>
+      <w:lvlText w:val=""/>
+      <w:lvlJc w:val="left"/>
+      <w:pPr>
+        <w:ind w:left="3672" w:hanging="360"/>
+      </w:pPr>
+      <w:rPr>
+        <w:rFonts w:ascii="Symbol" w:hAnsi="Symbol" w:hint="default"/>
+      </w:rPr>
+    </w:lvl>
+    <w:lvl w:ilvl="4" w:tplc="0C0A0003" w:tentative="1">
+      <w:start w:val="1"/>
+      <w:numFmt w:val="bullet"/>
+      <w:lvlText w:val="o"/>
+      <w:lvlJc w:val="left"/>
+      <w:pPr>
+        <w:ind w:left="4392" w:hanging="360"/>
+      </w:pPr>
+      <w:rPr>
+        <w:rFonts w:ascii="Courier New" w:hAnsi="Courier New" w:cs="Courier New" w:hint="default"/>
+      </w:rPr>
+    </w:lvl>
+    <w:lvl w:ilvl="5" w:tplc="0C0A0005" w:tentative="1">
+      <w:start w:val="1"/>
+      <w:numFmt w:val="bullet"/>
+      <w:lvlText w:val=""/>
+      <w:lvlJc w:val="left"/>
+      <w:pPr>
+        <w:ind w:left="5112" w:hanging="360"/>
+      </w:pPr>
+      <w:rPr>
+        <w:rFonts w:ascii="Wingdings" w:hAnsi="Wingdings" w:hint="default"/>
+      </w:rPr>
+    </w:lvl>
+    <w:lvl w:ilvl="6" w:tplc="0C0A0001" w:tentative="1">
+      <w:start w:val="1"/>
+      <w:numFmt w:val="bullet"/>
+      <w:lvlText w:val=""/>
+      <w:lvlJc w:val="left"/>
+      <w:pPr>
+        <w:ind w:left="5832" w:hanging="360"/>
+      </w:pPr>
+      <w:rPr>
+        <w:rFonts w:ascii="Symbol" w:hAnsi="Symbol" w:hint="default"/>
+      </w:rPr>
+    </w:lvl>
+    <w:lvl w:ilvl="7" w:tplc="0C0A0003" w:tentative="1">
+      <w:start w:val="1"/>
+      <w:numFmt w:val="bullet"/>
+      <w:lvlText w:val="o"/>
+      <w:lvlJc w:val="left"/>
+      <w:pPr>
+        <w:ind w:left="6552" w:hanging="360"/>
+      </w:pPr>
+      <w:rPr>
+        <w:rFonts w:ascii="Courier New" w:hAnsi="Courier New" w:cs="Courier New" w:hint="default"/>
+      </w:rPr>
+    </w:lvl>
+    <w:lvl w:ilvl="8" w:tplc="0C0A0005" w:tentative="1">
+      <w:start w:val="1"/>
+      <w:numFmt w:val="bullet"/>
+      <w:lvlText w:val=""/>
+      <w:lvlJc w:val="left"/>
+      <w:pPr>
+        <w:ind w:left="7272" w:hanging="360"/>
+      </w:pPr>
+      <w:rPr>
+        <w:rFonts w:ascii="Wingdings" w:hAnsi="Wingdings" w:hint="default"/>
+      </w:rPr>
+    </w:lvl>
+  </w:abstractNum>
+  <w:abstractNum w:abstractNumId="7" w15:restartNumberingAfterBreak="0">
+    <w:nsid w:val="47CE6FDA"/>
+    <w:multiLevelType w:val="hybridMultilevel"/>
+    <w:tmpl w:val="770EDE6A"/>
+    <w:lvl w:ilvl="0" w:tplc="0C0A000F">
+      <w:start w:val="1"/>
+      <w:numFmt w:val="decimal"/>
+      <w:lvlText w:val="%1."/>
+      <w:lvlJc w:val="left"/>
+      <w:pPr>
+        <w:ind w:left="1512" w:hanging="360"/>
+      </w:pPr>
+    </w:lvl>
+    <w:lvl w:ilvl="1" w:tplc="0C0A0019" w:tentative="1">
+      <w:start w:val="1"/>
+      <w:numFmt w:val="lowerLetter"/>
+      <w:lvlText w:val="%2."/>
+      <w:lvlJc w:val="left"/>
+      <w:pPr>
+        <w:ind w:left="2232" w:hanging="360"/>
+      </w:pPr>
+    </w:lvl>
+    <w:lvl w:ilvl="2" w:tplc="0C0A001B" w:tentative="1">
+      <w:start w:val="1"/>
+      <w:numFmt w:val="lowerRoman"/>
+      <w:lvlText w:val="%3."/>
+      <w:lvlJc w:val="right"/>
+      <w:pPr>
+        <w:ind w:left="2952" w:hanging="180"/>
+      </w:pPr>
+    </w:lvl>
+    <w:lvl w:ilvl="3" w:tplc="0C0A000F" w:tentative="1">
+      <w:start w:val="1"/>
+      <w:numFmt w:val="decimal"/>
+      <w:lvlText w:val="%4."/>
+      <w:lvlJc w:val="left"/>
+      <w:pPr>
+        <w:ind w:left="3672" w:hanging="360"/>
+      </w:pPr>
+    </w:lvl>
+    <w:lvl w:ilvl="4" w:tplc="0C0A0019" w:tentative="1">
+      <w:start w:val="1"/>
+      <w:numFmt w:val="lowerLetter"/>
+      <w:lvlText w:val="%5."/>
+      <w:lvlJc w:val="left"/>
+      <w:pPr>
+        <w:ind w:left="4392" w:hanging="360"/>
+      </w:pPr>
+    </w:lvl>
+    <w:lvl w:ilvl="5" w:tplc="0C0A001B" w:tentative="1">
+      <w:start w:val="1"/>
+      <w:numFmt w:val="lowerRoman"/>
+      <w:lvlText w:val="%6."/>
+      <w:lvlJc w:val="right"/>
+      <w:pPr>
+        <w:ind w:left="5112" w:hanging="180"/>
+      </w:pPr>
+    </w:lvl>
+    <w:lvl w:ilvl="6" w:tplc="0C0A000F" w:tentative="1">
+      <w:start w:val="1"/>
+      <w:numFmt w:val="decimal"/>
+      <w:lvlText w:val="%7."/>
+      <w:lvlJc w:val="left"/>
+      <w:pPr>
+        <w:ind w:left="5832" w:hanging="360"/>
+      </w:pPr>
+    </w:lvl>
+    <w:lvl w:ilvl="7" w:tplc="0C0A0019" w:tentative="1">
+      <w:start w:val="1"/>
+      <w:numFmt w:val="lowerLetter"/>
+      <w:lvlText w:val="%8."/>
+      <w:lvlJc w:val="left"/>
+      <w:pPr>
+        <w:ind w:left="6552" w:hanging="360"/>
+      </w:pPr>
+    </w:lvl>
+    <w:lvl w:ilvl="8" w:tplc="0C0A001B" w:tentative="1">
+      <w:start w:val="1"/>
+      <w:numFmt w:val="lowerRoman"/>
+      <w:lvlText w:val="%9."/>
+      <w:lvlJc w:val="right"/>
+      <w:pPr>
+        <w:ind w:left="7272" w:hanging="180"/>
+      </w:pPr>
+    </w:lvl>
+  </w:abstractNum>
+  <w:abstractNum w:abstractNumId="8" w15:restartNumberingAfterBreak="0">
     <w:nsid w:val="4E734B64"/>
     <w:multiLevelType w:val="multilevel"/>
     <w:tmpl w:val="0C0A001F"/>
@@ -2628,7 +5900,7 @@
       </w:pPr>
     </w:lvl>
   </w:abstractNum>
-  <w:abstractNum w:abstractNumId="5" w15:restartNumberingAfterBreak="0">
+  <w:abstractNum w:abstractNumId="9" w15:restartNumberingAfterBreak="0">
     <w:nsid w:val="52A67267"/>
     <w:multiLevelType w:val="hybridMultilevel"/>
     <w:tmpl w:val="F06636D8"/>
@@ -2717,7 +5989,7 @@
       </w:pPr>
     </w:lvl>
   </w:abstractNum>
-  <w:abstractNum w:abstractNumId="6" w15:restartNumberingAfterBreak="0">
+  <w:abstractNum w:abstractNumId="10" w15:restartNumberingAfterBreak="0">
     <w:nsid w:val="5FC96DC6"/>
     <w:multiLevelType w:val="hybridMultilevel"/>
     <w:tmpl w:val="C0A61450"/>
@@ -2807,7 +6079,7 @@
       </w:pPr>
     </w:lvl>
   </w:abstractNum>
-  <w:abstractNum w:abstractNumId="7" w15:restartNumberingAfterBreak="0">
+  <w:abstractNum w:abstractNumId="11" w15:restartNumberingAfterBreak="0">
     <w:nsid w:val="743D0693"/>
     <w:multiLevelType w:val="hybridMultilevel"/>
     <w:tmpl w:val="19B0BA48"/>
@@ -2897,28 +6169,40 @@
     </w:lvl>
   </w:abstractNum>
   <w:num w:numId="1">
+    <w:abstractNumId w:val="5"/>
+  </w:num>
+  <w:num w:numId="2">
+    <w:abstractNumId w:val="2"/>
+  </w:num>
+  <w:num w:numId="3">
+    <w:abstractNumId w:val="4"/>
+  </w:num>
+  <w:num w:numId="4">
+    <w:abstractNumId w:val="10"/>
+  </w:num>
+  <w:num w:numId="5">
     <w:abstractNumId w:val="3"/>
   </w:num>
-  <w:num w:numId="2">
-    <w:abstractNumId w:val="0"/>
+  <w:num w:numId="6">
+    <w:abstractNumId w:val="9"/>
   </w:num>
-  <w:num w:numId="3">
-    <w:abstractNumId w:val="2"/>
+  <w:num w:numId="7">
+    <w:abstractNumId w:val="8"/>
   </w:num>
-  <w:num w:numId="4">
+  <w:num w:numId="8">
+    <w:abstractNumId w:val="11"/>
+  </w:num>
+  <w:num w:numId="9">
+    <w:abstractNumId w:val="7"/>
+  </w:num>
+  <w:num w:numId="10">
     <w:abstractNumId w:val="6"/>
   </w:num>
-  <w:num w:numId="5">
+  <w:num w:numId="11">
     <w:abstractNumId w:val="1"/>
   </w:num>
-  <w:num w:numId="6">
-    <w:abstractNumId w:val="5"/>
-  </w:num>
-  <w:num w:numId="7">
-    <w:abstractNumId w:val="4"/>
-  </w:num>
-  <w:num w:numId="8">
-    <w:abstractNumId w:val="7"/>
+  <w:num w:numId="12">
+    <w:abstractNumId w:val="0"/>
   </w:num>
 </w:numbering>
 </file>
@@ -3317,6 +6601,26 @@
     <w:name w:val="Normal"/>
     <w:qFormat/>
   </w:style>
+  <w:style w:type="paragraph" w:styleId="Ttulo3">
+    <w:name w:val="heading 3"/>
+    <w:basedOn w:val="Normal"/>
+    <w:link w:val="Ttulo3Car"/>
+    <w:uiPriority w:val="9"/>
+    <w:qFormat/>
+    <w:rsid w:val="00B16995"/>
+    <w:pPr>
+      <w:spacing w:before="100" w:beforeAutospacing="1" w:after="100" w:afterAutospacing="1" w:line="240" w:lineRule="auto"/>
+      <w:outlineLvl w:val="2"/>
+    </w:pPr>
+    <w:rPr>
+      <w:rFonts w:ascii="Times New Roman" w:eastAsia="Times New Roman" w:hAnsi="Times New Roman" w:cs="Times New Roman"/>
+      <w:b/>
+      <w:bCs/>
+      <w:sz w:val="27"/>
+      <w:szCs w:val="27"/>
+      <w:lang w:eastAsia="es-ES"/>
+    </w:rPr>
+  </w:style>
   <w:style w:type="character" w:default="1" w:styleId="Fuentedeprrafopredeter">
     <w:name w:val="Default Paragraph Font"/>
     <w:uiPriority w:val="1"/>
@@ -3354,6 +6658,49 @@
       <w:ind w:left="720"/>
       <w:contextualSpacing/>
     </w:pPr>
+  </w:style>
+  <w:style w:type="character" w:styleId="Hipervnculo">
+    <w:name w:val="Hyperlink"/>
+    <w:basedOn w:val="Fuentedeprrafopredeter"/>
+    <w:uiPriority w:val="99"/>
+    <w:unhideWhenUsed/>
+    <w:rsid w:val="001057FC"/>
+    <w:rPr>
+      <w:color w:val="0563C1" w:themeColor="hyperlink"/>
+      <w:u w:val="single"/>
+    </w:rPr>
+  </w:style>
+  <w:style w:type="character" w:styleId="Hipervnculovisitado">
+    <w:name w:val="FollowedHyperlink"/>
+    <w:basedOn w:val="Fuentedeprrafopredeter"/>
+    <w:uiPriority w:val="99"/>
+    <w:semiHidden/>
+    <w:unhideWhenUsed/>
+    <w:rsid w:val="002165CD"/>
+    <w:rPr>
+      <w:color w:val="954F72" w:themeColor="followedHyperlink"/>
+      <w:u w:val="single"/>
+    </w:rPr>
+  </w:style>
+  <w:style w:type="character" w:customStyle="1" w:styleId="Ttulo3Car">
+    <w:name w:val="Título 3 Car"/>
+    <w:basedOn w:val="Fuentedeprrafopredeter"/>
+    <w:link w:val="Ttulo3"/>
+    <w:uiPriority w:val="9"/>
+    <w:rsid w:val="00B16995"/>
+    <w:rPr>
+      <w:rFonts w:ascii="Times New Roman" w:eastAsia="Times New Roman" w:hAnsi="Times New Roman" w:cs="Times New Roman"/>
+      <w:b/>
+      <w:bCs/>
+      <w:sz w:val="27"/>
+      <w:szCs w:val="27"/>
+      <w:lang w:eastAsia="es-ES"/>
+    </w:rPr>
+  </w:style>
+  <w:style w:type="character" w:customStyle="1" w:styleId="name">
+    <w:name w:val="name"/>
+    <w:basedOn w:val="Fuentedeprrafopredeter"/>
+    <w:rsid w:val="00B16995"/>
   </w:style>
 </w:styles>
 </file>

</xml_diff>